<commit_message>
methods done, now coordinate system and calibration
</commit_message>
<xml_diff>
--- a/Thesis Text.docx
+++ b/Thesis Text.docx
@@ -20,10 +20,21 @@
           <w:sz w:val="22"/>
           <w:szCs w:val="22"/>
         </w:rPr>
-        <w:t xml:space="preserve">2.1 Gaze </w:t>
-      </w:r>
-      <w:proofErr w:type="spellStart"/>
-      <w:r>
+        <w:t>Grundlagen</w:t>
+      </w:r>
+    </w:p>
+    <w:p>
+      <w:pPr>
+        <w:rPr>
+          <w:rFonts w:ascii="Calibri" w:hAnsi="Calibri" w:cs="Calibri"/>
+          <w:bCs/>
+          <w:sz w:val="20"/>
+          <w:szCs w:val="20"/>
+        </w:rPr>
+      </w:pPr>
+    </w:p>
+    <w:p>
+      <w:pPr>
         <w:rPr>
           <w:rFonts w:ascii="Calibri" w:hAnsi="Calibri" w:cs="Calibri"/>
           <w:b/>
@@ -31,19 +42,10 @@
           <w:sz w:val="22"/>
           <w:szCs w:val="22"/>
         </w:rPr>
-        <w:t>Estimation</w:t>
-      </w:r>
-      <w:proofErr w:type="spellEnd"/>
-    </w:p>
-    <w:p>
-      <w:pPr>
-        <w:rPr>
-          <w:rFonts w:ascii="Calibri" w:hAnsi="Calibri" w:cs="Calibri"/>
-          <w:sz w:val="22"/>
-          <w:szCs w:val="22"/>
-        </w:rPr>
-      </w:pPr>
-      <w:r>
+      </w:pPr>
+    </w:p>
+    <w:p>
+      <w:pPr>
         <w:rPr>
           <w:rFonts w:ascii="Calibri" w:hAnsi="Calibri" w:cs="Calibri"/>
           <w:b/>
@@ -51,70 +53,35 @@
           <w:sz w:val="22"/>
           <w:szCs w:val="22"/>
         </w:rPr>
+      </w:pPr>
+      <w:r>
+        <w:rPr>
+          <w:rFonts w:ascii="Calibri" w:hAnsi="Calibri" w:cs="Calibri"/>
+          <w:b/>
+          <w:bCs/>
+          <w:sz w:val="22"/>
+          <w:szCs w:val="22"/>
+        </w:rPr>
+        <w:t>2.1 Gaze Estimation</w:t>
+      </w:r>
+    </w:p>
+    <w:p>
+      <w:pPr>
+        <w:rPr>
+          <w:rFonts w:ascii="Calibri" w:hAnsi="Calibri" w:cs="Calibri"/>
+          <w:sz w:val="22"/>
+          <w:szCs w:val="22"/>
+        </w:rPr>
+      </w:pPr>
+      <w:r>
+        <w:rPr>
+          <w:rFonts w:ascii="Calibri" w:hAnsi="Calibri" w:cs="Calibri"/>
+          <w:b/>
+          <w:bCs/>
+          <w:sz w:val="22"/>
+          <w:szCs w:val="22"/>
+        </w:rPr>
         <w:t>Definition</w:t>
-      </w:r>
-    </w:p>
-    <w:p>
-      <w:pPr>
-        <w:numPr>
-          <w:ilvl w:val="0"/>
-          <w:numId w:val="1"/>
-        </w:numPr>
-        <w:rPr>
-          <w:rFonts w:ascii="Calibri" w:hAnsi="Calibri" w:cs="Calibri"/>
-          <w:sz w:val="22"/>
-          <w:szCs w:val="22"/>
-        </w:rPr>
-      </w:pPr>
-      <w:r>
-        <w:rPr>
-          <w:rFonts w:ascii="Calibri" w:hAnsi="Calibri" w:cs="Calibri"/>
-          <w:sz w:val="22"/>
-          <w:szCs w:val="22"/>
-        </w:rPr>
-        <w:t>Was ist Blickschätzung?</w:t>
-      </w:r>
-    </w:p>
-    <w:p>
-      <w:pPr>
-        <w:numPr>
-          <w:ilvl w:val="0"/>
-          <w:numId w:val="1"/>
-        </w:numPr>
-        <w:rPr>
-          <w:rFonts w:ascii="Calibri" w:hAnsi="Calibri" w:cs="Calibri"/>
-          <w:sz w:val="22"/>
-          <w:szCs w:val="22"/>
-        </w:rPr>
-      </w:pPr>
-      <w:r>
-        <w:rPr>
-          <w:rFonts w:ascii="Calibri" w:hAnsi="Calibri" w:cs="Calibri"/>
-          <w:sz w:val="22"/>
-          <w:szCs w:val="22"/>
-        </w:rPr>
-        <w:t>2D-Gaze vs. 3D-Gaze</w:t>
-      </w:r>
-    </w:p>
-    <w:p>
-      <w:pPr>
-        <w:numPr>
-          <w:ilvl w:val="0"/>
-          <w:numId w:val="1"/>
-        </w:numPr>
-        <w:rPr>
-          <w:rFonts w:ascii="Calibri" w:hAnsi="Calibri" w:cs="Calibri"/>
-          <w:sz w:val="22"/>
-          <w:szCs w:val="22"/>
-        </w:rPr>
-      </w:pPr>
-      <w:r>
-        <w:rPr>
-          <w:rFonts w:ascii="Calibri" w:hAnsi="Calibri" w:cs="Calibri"/>
-          <w:sz w:val="22"/>
-          <w:szCs w:val="22"/>
-        </w:rPr>
-        <w:t>Anwendungen</w:t>
       </w:r>
     </w:p>
     <w:p>
@@ -198,18 +165,8 @@
           <w:sz w:val="22"/>
           <w:szCs w:val="22"/>
         </w:rPr>
-        <w:t xml:space="preserve">Gaze </w:t>
-      </w:r>
-      <w:proofErr w:type="spellStart"/>
-      <w:r>
-        <w:rPr>
-          <w:rFonts w:ascii="Calibri" w:hAnsi="Calibri" w:cs="Calibri"/>
-          <w:sz w:val="22"/>
-          <w:szCs w:val="22"/>
-        </w:rPr>
-        <w:t>Estimation</w:t>
-      </w:r>
-      <w:proofErr w:type="spellEnd"/>
+        <w:t>Gaze Estimation</w:t>
+      </w:r>
       <w:r>
         <w:rPr>
           <w:rFonts w:ascii="Calibri" w:hAnsi="Calibri" w:cs="Calibri"/>
@@ -224,7 +181,47 @@
           <w:sz w:val="22"/>
           <w:szCs w:val="22"/>
         </w:rPr>
-        <w:t xml:space="preserve"> erfolgt in</w:t>
+        <w:t xml:space="preserve"> </w:t>
+      </w:r>
+      <w:r>
+        <w:rPr>
+          <w:rFonts w:ascii="Calibri" w:hAnsi="Calibri" w:cs="Calibri"/>
+          <w:sz w:val="22"/>
+          <w:szCs w:val="22"/>
+        </w:rPr>
+        <w:t xml:space="preserve">ist ein Verfahren </w:t>
+      </w:r>
+      <w:r>
+        <w:rPr>
+          <w:rFonts w:ascii="Calibri" w:hAnsi="Calibri" w:cs="Calibri"/>
+          <w:sz w:val="22"/>
+          <w:szCs w:val="22"/>
+        </w:rPr>
+        <w:t>z</w:t>
+      </w:r>
+      <w:r>
+        <w:rPr>
+          <w:rFonts w:ascii="Calibri" w:hAnsi="Calibri" w:cs="Calibri"/>
+          <w:sz w:val="22"/>
+          <w:szCs w:val="22"/>
+        </w:rPr>
+        <w:t>ur Approximation der Blickrichtung einer Person anhand eines Bildes. Sie</w:t>
+      </w:r>
+      <w:r>
+        <w:rPr>
+          <w:rFonts w:ascii="Calibri" w:hAnsi="Calibri" w:cs="Calibri"/>
+          <w:sz w:val="22"/>
+          <w:szCs w:val="22"/>
+        </w:rPr>
+        <w:t xml:space="preserve"> </w:t>
+      </w:r>
+      <w:r>
+        <w:rPr>
+          <w:rFonts w:ascii="Calibri" w:hAnsi="Calibri" w:cs="Calibri"/>
+          <w:sz w:val="22"/>
+          <w:szCs w:val="22"/>
+        </w:rPr>
+        <w:t>erfolgt in</w:t>
       </w:r>
       <w:r>
         <w:rPr>
@@ -336,18 +333,32 @@
           <w:sz w:val="22"/>
           <w:szCs w:val="22"/>
         </w:rPr>
-        <w:t xml:space="preserve">Head Pose </w:t>
-      </w:r>
-      <w:proofErr w:type="spellStart"/>
-      <w:r>
-        <w:rPr>
-          <w:rFonts w:ascii="Calibri" w:hAnsi="Calibri" w:cs="Calibri"/>
-          <w:sz w:val="22"/>
-          <w:szCs w:val="22"/>
-        </w:rPr>
-        <w:t>Estimation</w:t>
-      </w:r>
-      <w:proofErr w:type="spellEnd"/>
+        <w:t>Head Pose Estimation</w:t>
+      </w:r>
+      <w:r>
+        <w:rPr>
+          <w:rFonts w:ascii="Calibri" w:hAnsi="Calibri" w:cs="Calibri"/>
+          <w:sz w:val="22"/>
+          <w:szCs w:val="22"/>
+        </w:rPr>
+        <w:t xml:space="preserve">, </w:t>
+      </w:r>
+      <w:r>
+        <w:rPr>
+          <w:rFonts w:ascii="Calibri" w:hAnsi="Calibri" w:cs="Calibri"/>
+          <w:sz w:val="22"/>
+          <w:szCs w:val="22"/>
+        </w:rPr>
+        <w:t>eine</w:t>
+      </w:r>
+      <w:r>
+        <w:rPr>
+          <w:rFonts w:ascii="Calibri" w:hAnsi="Calibri" w:cs="Calibri"/>
+          <w:sz w:val="22"/>
+          <w:szCs w:val="22"/>
+        </w:rPr>
+        <w:t xml:space="preserve"> Approximierung der räumlichen Orientierung des Kopfes,</w:t>
+      </w:r>
       <w:r>
         <w:rPr>
           <w:rFonts w:ascii="Calibri" w:hAnsi="Calibri" w:cs="Calibri"/>
@@ -386,7 +397,23 @@
           <w:sz w:val="22"/>
           <w:szCs w:val="22"/>
         </w:rPr>
-        <w:t xml:space="preserve">die Blickrichtung einer Person beziehungsweise das betrachtete Objekt </w:t>
+        <w:t xml:space="preserve">die Blickrichtung einer Person beziehungsweise </w:t>
+      </w:r>
+      <w:r>
+        <w:rPr>
+          <w:rFonts w:ascii="Calibri" w:hAnsi="Calibri" w:cs="Calibri"/>
+          <w:sz w:val="22"/>
+          <w:szCs w:val="22"/>
+        </w:rPr>
+        <w:t>den betrachteten Blickpunkt</w:t>
+      </w:r>
+      <w:r>
+        <w:rPr>
+          <w:rFonts w:ascii="Calibri" w:hAnsi="Calibri" w:cs="Calibri"/>
+          <w:sz w:val="22"/>
+          <w:szCs w:val="22"/>
+        </w:rPr>
+        <w:t xml:space="preserve"> </w:t>
       </w:r>
       <w:r>
         <w:rPr>
@@ -474,6 +501,14 @@
           <w:sz w:val="22"/>
           <w:szCs w:val="22"/>
         </w:rPr>
+        <w:t xml:space="preserve">die </w:t>
+      </w:r>
+      <w:r>
+        <w:rPr>
+          <w:rFonts w:ascii="Calibri" w:hAnsi="Calibri" w:cs="Calibri"/>
+          <w:sz w:val="22"/>
+          <w:szCs w:val="22"/>
+        </w:rPr>
         <w:t>Blickposition</w:t>
       </w:r>
       <w:r>
@@ -562,24 +597,23 @@
           <w:sz w:val="22"/>
           <w:szCs w:val="22"/>
         </w:rPr>
-        <w:t xml:space="preserve"> Raum beschreibt.</w:t>
-      </w:r>
-    </w:p>
-    <w:p>
-      <w:pPr>
-        <w:rPr>
-          <w:rFonts w:ascii="Calibri" w:hAnsi="Calibri" w:cs="Calibri"/>
-          <w:sz w:val="22"/>
-          <w:szCs w:val="22"/>
-        </w:rPr>
-      </w:pPr>
-      <w:r>
-        <w:rPr>
-          <w:rFonts w:ascii="Calibri" w:hAnsi="Calibri" w:cs="Calibri"/>
-          <w:sz w:val="22"/>
-          <w:szCs w:val="22"/>
-        </w:rPr>
-        <w:t>Anwendungen</w:t>
+        <w:t xml:space="preserve"> Rau</w:t>
+      </w:r>
+      <w:r>
+        <w:rPr>
+          <w:rFonts w:ascii="Calibri" w:hAnsi="Calibri" w:cs="Calibri"/>
+          <w:sz w:val="22"/>
+          <w:szCs w:val="22"/>
+        </w:rPr>
+        <w:t>m</w:t>
+      </w:r>
+      <w:r>
+        <w:rPr>
+          <w:rFonts w:ascii="Calibri" w:hAnsi="Calibri" w:cs="Calibri"/>
+          <w:sz w:val="22"/>
+          <w:szCs w:val="22"/>
+        </w:rPr>
+        <w:t>.</w:t>
       </w:r>
     </w:p>
     <w:p>
@@ -597,16 +631,119 @@
           <w:szCs w:val="22"/>
           <w:highlight w:val="yellow"/>
         </w:rPr>
-        <w:t>Sie findet Anwendung</w:t>
-      </w:r>
-      <w:r>
-        <w:rPr>
-          <w:rFonts w:ascii="Calibri" w:hAnsi="Calibri" w:cs="Calibri"/>
-          <w:sz w:val="22"/>
-          <w:szCs w:val="22"/>
-          <w:highlight w:val="yellow"/>
-        </w:rPr>
-        <w:t xml:space="preserve"> für uns speziell bei der Fahrerüberwachung (Driver Monitoring) um Ablenkungen, Müdigkeit oder Unaufmerksamkeit zu erkennen</w:t>
+        <w:t xml:space="preserve">Sie findet </w:t>
+      </w:r>
+      <w:r>
+        <w:rPr>
+          <w:rFonts w:ascii="Calibri" w:hAnsi="Calibri" w:cs="Calibri"/>
+          <w:sz w:val="22"/>
+          <w:szCs w:val="22"/>
+        </w:rPr>
+        <w:t>insbesondere</w:t>
+      </w:r>
+      <w:r>
+        <w:rPr>
+          <w:rFonts w:ascii="Calibri" w:hAnsi="Calibri" w:cs="Calibri"/>
+          <w:sz w:val="22"/>
+          <w:szCs w:val="22"/>
+        </w:rPr>
+        <w:t xml:space="preserve"> Anwendung</w:t>
+      </w:r>
+      <w:r>
+        <w:rPr>
+          <w:rFonts w:ascii="Calibri" w:hAnsi="Calibri" w:cs="Calibri"/>
+          <w:sz w:val="22"/>
+          <w:szCs w:val="22"/>
+        </w:rPr>
+        <w:t xml:space="preserve"> </w:t>
+      </w:r>
+      <w:r>
+        <w:rPr>
+          <w:rFonts w:ascii="Calibri" w:hAnsi="Calibri" w:cs="Calibri"/>
+          <w:sz w:val="22"/>
+          <w:szCs w:val="22"/>
+        </w:rPr>
+        <w:t>in den</w:t>
+      </w:r>
+      <w:r>
+        <w:rPr>
+          <w:rFonts w:ascii="Calibri" w:hAnsi="Calibri" w:cs="Calibri"/>
+          <w:sz w:val="22"/>
+          <w:szCs w:val="22"/>
+        </w:rPr>
+        <w:t xml:space="preserve"> Bereich</w:t>
+      </w:r>
+      <w:r>
+        <w:rPr>
+          <w:rFonts w:ascii="Calibri" w:hAnsi="Calibri" w:cs="Calibri"/>
+          <w:sz w:val="22"/>
+          <w:szCs w:val="22"/>
+        </w:rPr>
+        <w:t>en</w:t>
+      </w:r>
+      <w:r>
+        <w:rPr>
+          <w:rFonts w:ascii="Calibri" w:hAnsi="Calibri" w:cs="Calibri"/>
+          <w:sz w:val="22"/>
+          <w:szCs w:val="22"/>
+        </w:rPr>
+        <w:t xml:space="preserve"> der </w:t>
+      </w:r>
+      <w:r>
+        <w:rPr>
+          <w:rFonts w:ascii="Calibri" w:hAnsi="Calibri" w:cs="Calibri"/>
+          <w:sz w:val="22"/>
+          <w:szCs w:val="22"/>
+        </w:rPr>
+        <w:t>Mensch</w:t>
+      </w:r>
+      <w:r>
+        <w:rPr>
+          <w:rFonts w:ascii="Calibri" w:hAnsi="Calibri" w:cs="Calibri"/>
+          <w:sz w:val="22"/>
+          <w:szCs w:val="22"/>
+        </w:rPr>
+        <w:t>-Computer-Intera</w:t>
+      </w:r>
+      <w:r>
+        <w:rPr>
+          <w:rFonts w:ascii="Calibri" w:hAnsi="Calibri" w:cs="Calibri"/>
+          <w:sz w:val="22"/>
+          <w:szCs w:val="22"/>
+        </w:rPr>
+        <w:t>k</w:t>
+      </w:r>
+      <w:r>
+        <w:rPr>
+          <w:rFonts w:ascii="Calibri" w:hAnsi="Calibri" w:cs="Calibri"/>
+          <w:sz w:val="22"/>
+          <w:szCs w:val="22"/>
+        </w:rPr>
+        <w:t>tion</w:t>
+      </w:r>
+      <w:r>
+        <w:rPr>
+          <w:rFonts w:ascii="Calibri" w:hAnsi="Calibri" w:cs="Calibri"/>
+          <w:sz w:val="22"/>
+          <w:szCs w:val="22"/>
+        </w:rPr>
+        <w:t xml:space="preserve"> (Human-Computer Interaction, HCI)</w:t>
+      </w:r>
+      <w:r>
+        <w:rPr>
+          <w:rFonts w:ascii="Calibri" w:hAnsi="Calibri" w:cs="Calibri"/>
+          <w:sz w:val="22"/>
+          <w:szCs w:val="22"/>
+        </w:rPr>
+        <w:t>,</w:t>
+      </w:r>
+      <w:r>
+        <w:rPr>
+          <w:rFonts w:ascii="Calibri" w:hAnsi="Calibri" w:cs="Calibri"/>
+          <w:sz w:val="22"/>
+          <w:szCs w:val="22"/>
+        </w:rPr>
+        <w:t xml:space="preserve"> der Analyse von Aufmerksamkeit und kognitiven Zuständen sowie in biometrischen Systemen</w:t>
       </w:r>
       <w:r>
         <w:rPr>
@@ -616,6 +753,23 @@
         </w:rPr>
         <w:t>.</w:t>
       </w:r>
+      <w:r>
+        <w:rPr>
+          <w:rFonts w:ascii="Calibri" w:hAnsi="Calibri" w:cs="Calibri"/>
+          <w:sz w:val="22"/>
+          <w:szCs w:val="22"/>
+        </w:rPr>
+        <w:t xml:space="preserve"> Darüber hinaus gewinnt diese Technologie zunehmend an Bedeutung in Verbraucheranwendungen wie Virtual/Augmented Reality und Fahrerüberwachungssystemen. Durch die berührungslose Erfassung der Blickrichtung wird eine intuitive Interkation mit technischen Systemen ermöglicht und es können wichtige Informationen über das Verhalten und die Aufmerksamkeit des Nutzenden beschaffen werden.</w:t>
+      </w:r>
+    </w:p>
+    <w:p>
+      <w:pPr>
+        <w:rPr>
+          <w:rFonts w:ascii="Calibri" w:hAnsi="Calibri" w:cs="Calibri"/>
+          <w:sz w:val="22"/>
+          <w:szCs w:val="22"/>
+        </w:rPr>
+      </w:pPr>
     </w:p>
     <w:p>
       <w:pPr>
@@ -664,126 +818,6 @@
           <w:szCs w:val="22"/>
         </w:rPr>
         <w:t>2.1.1 Modellbasierte Verfahren</w:t>
-      </w:r>
-    </w:p>
-    <w:p>
-      <w:pPr>
-        <w:numPr>
-          <w:ilvl w:val="0"/>
-          <w:numId w:val="3"/>
-        </w:numPr>
-        <w:rPr>
-          <w:rFonts w:ascii="Calibri" w:hAnsi="Calibri" w:cs="Calibri"/>
-          <w:sz w:val="22"/>
-          <w:szCs w:val="22"/>
-        </w:rPr>
-      </w:pPr>
-      <w:r>
-        <w:rPr>
-          <w:rFonts w:ascii="Calibri" w:hAnsi="Calibri" w:cs="Calibri"/>
-          <w:sz w:val="22"/>
-          <w:szCs w:val="22"/>
-        </w:rPr>
-        <w:t>Grundprinzip</w:t>
-      </w:r>
-    </w:p>
-    <w:p>
-      <w:pPr>
-        <w:numPr>
-          <w:ilvl w:val="0"/>
-          <w:numId w:val="3"/>
-        </w:numPr>
-        <w:rPr>
-          <w:rFonts w:ascii="Calibri" w:hAnsi="Calibri" w:cs="Calibri"/>
-          <w:sz w:val="22"/>
-          <w:szCs w:val="22"/>
-        </w:rPr>
-      </w:pPr>
-      <w:r>
-        <w:rPr>
-          <w:rFonts w:ascii="Calibri" w:hAnsi="Calibri" w:cs="Calibri"/>
-          <w:sz w:val="22"/>
-          <w:szCs w:val="22"/>
-        </w:rPr>
-        <w:t>Shape-</w:t>
-      </w:r>
-      <w:proofErr w:type="spellStart"/>
-      <w:r>
-        <w:rPr>
-          <w:rFonts w:ascii="Calibri" w:hAnsi="Calibri" w:cs="Calibri"/>
-          <w:sz w:val="22"/>
-          <w:szCs w:val="22"/>
-        </w:rPr>
-        <w:t>Based</w:t>
-      </w:r>
-      <w:proofErr w:type="spellEnd"/>
-      <w:r>
-        <w:rPr>
-          <w:rFonts w:ascii="Calibri" w:hAnsi="Calibri" w:cs="Calibri"/>
-          <w:sz w:val="22"/>
-          <w:szCs w:val="22"/>
-        </w:rPr>
-        <w:t xml:space="preserve"> Models</w:t>
-      </w:r>
-    </w:p>
-    <w:p>
-      <w:pPr>
-        <w:numPr>
-          <w:ilvl w:val="0"/>
-          <w:numId w:val="3"/>
-        </w:numPr>
-        <w:rPr>
-          <w:rFonts w:ascii="Calibri" w:hAnsi="Calibri" w:cs="Calibri"/>
-          <w:sz w:val="22"/>
-          <w:szCs w:val="22"/>
-        </w:rPr>
-      </w:pPr>
-      <w:r>
-        <w:rPr>
-          <w:rFonts w:ascii="Calibri" w:hAnsi="Calibri" w:cs="Calibri"/>
-          <w:sz w:val="22"/>
-          <w:szCs w:val="22"/>
-        </w:rPr>
-        <w:t>Feature-</w:t>
-      </w:r>
-      <w:proofErr w:type="spellStart"/>
-      <w:r>
-        <w:rPr>
-          <w:rFonts w:ascii="Calibri" w:hAnsi="Calibri" w:cs="Calibri"/>
-          <w:sz w:val="22"/>
-          <w:szCs w:val="22"/>
-        </w:rPr>
-        <w:t>Based</w:t>
-      </w:r>
-      <w:proofErr w:type="spellEnd"/>
-      <w:r>
-        <w:rPr>
-          <w:rFonts w:ascii="Calibri" w:hAnsi="Calibri" w:cs="Calibri"/>
-          <w:sz w:val="22"/>
-          <w:szCs w:val="22"/>
-        </w:rPr>
-        <w:t xml:space="preserve"> Models</w:t>
-      </w:r>
-    </w:p>
-    <w:p>
-      <w:pPr>
-        <w:numPr>
-          <w:ilvl w:val="0"/>
-          <w:numId w:val="3"/>
-        </w:numPr>
-        <w:rPr>
-          <w:rFonts w:ascii="Calibri" w:hAnsi="Calibri" w:cs="Calibri"/>
-          <w:sz w:val="22"/>
-          <w:szCs w:val="22"/>
-        </w:rPr>
-      </w:pPr>
-      <w:r>
-        <w:rPr>
-          <w:rFonts w:ascii="Calibri" w:hAnsi="Calibri" w:cs="Calibri"/>
-          <w:sz w:val="22"/>
-          <w:szCs w:val="22"/>
-        </w:rPr>
-        <w:t>Hornhautreflexion</w:t>
       </w:r>
     </w:p>
     <w:p>
@@ -826,6 +860,27 @@
     </w:p>
     <w:p>
       <w:pPr>
+        <w:numPr>
+          <w:ilvl w:val="0"/>
+          <w:numId w:val="4"/>
+        </w:numPr>
+        <w:rPr>
+          <w:rFonts w:ascii="Calibri" w:hAnsi="Calibri" w:cs="Calibri"/>
+          <w:sz w:val="22"/>
+          <w:szCs w:val="22"/>
+        </w:rPr>
+      </w:pPr>
+      <w:r>
+        <w:rPr>
+          <w:rFonts w:ascii="Calibri" w:hAnsi="Calibri" w:cs="Calibri"/>
+          <w:sz w:val="22"/>
+          <w:szCs w:val="22"/>
+        </w:rPr>
+        <w:t>Henessey et al. (2006)</w:t>
+      </w:r>
+    </w:p>
+    <w:p>
+      <w:pPr>
         <w:rPr>
           <w:rFonts w:ascii="Calibri" w:hAnsi="Calibri" w:cs="Calibri"/>
           <w:sz w:val="22"/>
@@ -990,15 +1045,24 @@
           <w:sz w:val="22"/>
           <w:szCs w:val="22"/>
         </w:rPr>
-        <w:t xml:space="preserve"> kann anschließend die Blickrichtung berechnet werden. Hansen und Ji unterscheiden </w:t>
-      </w:r>
-      <w:r>
-        <w:rPr>
-          <w:rFonts w:ascii="Calibri" w:hAnsi="Calibri" w:cs="Calibri"/>
-          <w:sz w:val="22"/>
-          <w:szCs w:val="22"/>
-        </w:rPr>
-        <w:t>innerhalb der modellbasierten Vehrfahren</w:t>
+        <w:t xml:space="preserve"> kann anschließend die </w:t>
+      </w:r>
+      <w:r>
+        <w:rPr>
+          <w:rFonts w:ascii="Calibri" w:hAnsi="Calibri" w:cs="Calibri"/>
+          <w:sz w:val="22"/>
+          <w:szCs w:val="22"/>
+        </w:rPr>
+        <w:lastRenderedPageBreak/>
+        <w:t xml:space="preserve">Blickrichtung berechnet werden. Hansen und Ji unterscheiden </w:t>
+      </w:r>
+      <w:r>
+        <w:rPr>
+          <w:rFonts w:ascii="Calibri" w:hAnsi="Calibri" w:cs="Calibri"/>
+          <w:sz w:val="22"/>
+          <w:szCs w:val="22"/>
+        </w:rPr>
+        <w:t>innerhalb der modellbasierten Verfahren</w:t>
       </w:r>
       <w:r>
         <w:rPr>
@@ -1022,25 +1086,7 @@
           <w:sz w:val="22"/>
           <w:szCs w:val="22"/>
         </w:rPr>
-        <w:t xml:space="preserve"> Shape-</w:t>
-      </w:r>
-      <w:proofErr w:type="spellStart"/>
-      <w:r>
-        <w:rPr>
-          <w:rFonts w:ascii="Calibri" w:hAnsi="Calibri" w:cs="Calibri"/>
-          <w:sz w:val="22"/>
-          <w:szCs w:val="22"/>
-        </w:rPr>
-        <w:t>Based</w:t>
-      </w:r>
-      <w:proofErr w:type="spellEnd"/>
-      <w:r>
-        <w:rPr>
-          <w:rFonts w:ascii="Calibri" w:hAnsi="Calibri" w:cs="Calibri"/>
-          <w:sz w:val="22"/>
-          <w:szCs w:val="22"/>
-        </w:rPr>
-        <w:t>-</w:t>
+        <w:t xml:space="preserve"> Shape-Based-</w:t>
       </w:r>
       <w:r>
         <w:rPr>
@@ -1056,25 +1102,7 @@
           <w:sz w:val="22"/>
           <w:szCs w:val="22"/>
         </w:rPr>
-        <w:t xml:space="preserve"> und Feature-</w:t>
-      </w:r>
-      <w:proofErr w:type="spellStart"/>
-      <w:r>
-        <w:rPr>
-          <w:rFonts w:ascii="Calibri" w:hAnsi="Calibri" w:cs="Calibri"/>
-          <w:sz w:val="22"/>
-          <w:szCs w:val="22"/>
-        </w:rPr>
-        <w:t>Based</w:t>
-      </w:r>
-      <w:proofErr w:type="spellEnd"/>
-      <w:r>
-        <w:rPr>
-          <w:rFonts w:ascii="Calibri" w:hAnsi="Calibri" w:cs="Calibri"/>
-          <w:sz w:val="22"/>
-          <w:szCs w:val="22"/>
-        </w:rPr>
-        <w:t>-Verfahren</w:t>
+        <w:t xml:space="preserve"> und Feature-Based-Verfahren</w:t>
       </w:r>
       <w:r>
         <w:rPr>
@@ -1101,7 +1129,6 @@
           <w:szCs w:val="22"/>
         </w:rPr>
       </w:pPr>
-      <w:proofErr w:type="spellStart"/>
       <w:r>
         <w:rPr>
           <w:rFonts w:ascii="Calibri" w:hAnsi="Calibri" w:cs="Calibri"/>
@@ -1109,10 +1136,289 @@
           <w:sz w:val="22"/>
           <w:szCs w:val="22"/>
         </w:rPr>
-        <w:lastRenderedPageBreak/>
-        <w:t>Shaped</w:t>
-      </w:r>
-      <w:proofErr w:type="spellEnd"/>
+        <w:t>Shaped-Based-Verfahren</w:t>
+      </w:r>
+      <w:r>
+        <w:rPr>
+          <w:rFonts w:ascii="Calibri" w:hAnsi="Calibri" w:cs="Calibri"/>
+          <w:sz w:val="22"/>
+          <w:szCs w:val="22"/>
+        </w:rPr>
+        <w:t xml:space="preserve"> verwenden</w:t>
+      </w:r>
+      <w:r>
+        <w:rPr>
+          <w:rFonts w:ascii="Calibri" w:hAnsi="Calibri" w:cs="Calibri"/>
+          <w:sz w:val="22"/>
+          <w:szCs w:val="22"/>
+        </w:rPr>
+        <w:t>,</w:t>
+      </w:r>
+      <w:r>
+        <w:rPr>
+          <w:rFonts w:ascii="Calibri" w:hAnsi="Calibri" w:cs="Calibri"/>
+          <w:sz w:val="22"/>
+          <w:szCs w:val="22"/>
+        </w:rPr>
+        <w:t xml:space="preserve"> </w:t>
+      </w:r>
+      <w:r>
+        <w:rPr>
+          <w:rFonts w:ascii="Calibri" w:hAnsi="Calibri" w:cs="Calibri"/>
+          <w:sz w:val="22"/>
+          <w:szCs w:val="22"/>
+        </w:rPr>
+        <w:t>neben dem</w:t>
+      </w:r>
+      <w:r>
+        <w:rPr>
+          <w:rFonts w:ascii="Calibri" w:hAnsi="Calibri" w:cs="Calibri"/>
+          <w:sz w:val="22"/>
+          <w:szCs w:val="22"/>
+        </w:rPr>
+        <w:t xml:space="preserve"> geometrische</w:t>
+      </w:r>
+      <w:r>
+        <w:rPr>
+          <w:rFonts w:ascii="Calibri" w:hAnsi="Calibri" w:cs="Calibri"/>
+          <w:sz w:val="22"/>
+          <w:szCs w:val="22"/>
+        </w:rPr>
+        <w:t>m</w:t>
+      </w:r>
+      <w:r>
+        <w:rPr>
+          <w:rFonts w:ascii="Calibri" w:hAnsi="Calibri" w:cs="Calibri"/>
+          <w:sz w:val="22"/>
+          <w:szCs w:val="22"/>
+        </w:rPr>
+        <w:t xml:space="preserve"> Augenmodell</w:t>
+      </w:r>
+      <w:r>
+        <w:rPr>
+          <w:rFonts w:ascii="Calibri" w:hAnsi="Calibri" w:cs="Calibri"/>
+          <w:sz w:val="22"/>
+          <w:szCs w:val="22"/>
+        </w:rPr>
+        <w:t xml:space="preserve">, </w:t>
+      </w:r>
+      <w:r>
+        <w:rPr>
+          <w:rFonts w:ascii="Calibri" w:hAnsi="Calibri" w:cs="Calibri"/>
+          <w:sz w:val="22"/>
+          <w:szCs w:val="22"/>
+        </w:rPr>
+        <w:t xml:space="preserve">zusätzlich </w:t>
+      </w:r>
+      <w:r>
+        <w:rPr>
+          <w:rFonts w:ascii="Calibri" w:hAnsi="Calibri" w:cs="Calibri"/>
+          <w:sz w:val="22"/>
+          <w:szCs w:val="22"/>
+        </w:rPr>
+        <w:t>ein Ähnlichkeitsmaß</w:t>
+      </w:r>
+      <w:r>
+        <w:rPr>
+          <w:rFonts w:ascii="Calibri" w:hAnsi="Calibri" w:cs="Calibri"/>
+          <w:sz w:val="22"/>
+          <w:szCs w:val="22"/>
+        </w:rPr>
+        <w:t xml:space="preserve"> (Similarity Measure)</w:t>
+      </w:r>
+      <w:r>
+        <w:rPr>
+          <w:rFonts w:ascii="Calibri" w:hAnsi="Calibri" w:cs="Calibri"/>
+          <w:sz w:val="22"/>
+          <w:szCs w:val="22"/>
+        </w:rPr>
+        <w:t xml:space="preserve">, um </w:t>
+      </w:r>
+      <w:r>
+        <w:rPr>
+          <w:rFonts w:ascii="Calibri" w:hAnsi="Calibri" w:cs="Calibri"/>
+          <w:sz w:val="22"/>
+          <w:szCs w:val="22"/>
+        </w:rPr>
+        <w:t xml:space="preserve">das Modell </w:t>
+      </w:r>
+      <w:r>
+        <w:rPr>
+          <w:rFonts w:ascii="Calibri" w:hAnsi="Calibri" w:cs="Calibri"/>
+          <w:sz w:val="22"/>
+          <w:szCs w:val="22"/>
+        </w:rPr>
+        <w:t>an die Bilddaten anzupassen.</w:t>
+      </w:r>
+      <w:r>
+        <w:rPr>
+          <w:rFonts w:ascii="Calibri" w:hAnsi="Calibri" w:cs="Calibri"/>
+          <w:sz w:val="22"/>
+          <w:szCs w:val="22"/>
+        </w:rPr>
+        <w:t xml:space="preserve"> Hierzu werden die Parameter des </w:t>
+      </w:r>
+      <w:r>
+        <w:rPr>
+          <w:rFonts w:ascii="Calibri" w:hAnsi="Calibri" w:cs="Calibri"/>
+          <w:sz w:val="22"/>
+          <w:szCs w:val="22"/>
+        </w:rPr>
+        <w:t xml:space="preserve">geometrischen </w:t>
+      </w:r>
+      <w:r>
+        <w:rPr>
+          <w:rFonts w:ascii="Calibri" w:hAnsi="Calibri" w:cs="Calibri"/>
+          <w:sz w:val="22"/>
+          <w:szCs w:val="22"/>
+        </w:rPr>
+        <w:t xml:space="preserve">Augenmodells iterativ verändert, bis eine möglichst hohe Übereinstimmung zwischen Modell und beobachtetem Auge im Bild erreicht wird. </w:t>
+      </w:r>
+      <w:r>
+        <w:rPr>
+          <w:rFonts w:ascii="Calibri" w:hAnsi="Calibri" w:cs="Calibri"/>
+          <w:sz w:val="22"/>
+          <w:szCs w:val="22"/>
+        </w:rPr>
+        <w:t xml:space="preserve">Die Anpassung </w:t>
+      </w:r>
+      <w:r>
+        <w:rPr>
+          <w:rFonts w:ascii="Calibri" w:hAnsi="Calibri" w:cs="Calibri"/>
+          <w:sz w:val="22"/>
+          <w:szCs w:val="22"/>
+        </w:rPr>
+        <w:t>erfolgt sowohl</w:t>
+      </w:r>
+      <w:r>
+        <w:rPr>
+          <w:rFonts w:ascii="Calibri" w:hAnsi="Calibri" w:cs="Calibri"/>
+          <w:sz w:val="22"/>
+          <w:szCs w:val="22"/>
+        </w:rPr>
+        <w:t xml:space="preserve"> durch starre</w:t>
+      </w:r>
+      <w:r>
+        <w:rPr>
+          <w:rFonts w:ascii="Calibri" w:hAnsi="Calibri" w:cs="Calibri"/>
+          <w:sz w:val="22"/>
+          <w:szCs w:val="22"/>
+        </w:rPr>
+        <w:t xml:space="preserve"> </w:t>
+      </w:r>
+      <w:r>
+        <w:rPr>
+          <w:rFonts w:ascii="Calibri" w:hAnsi="Calibri" w:cs="Calibri"/>
+          <w:sz w:val="22"/>
+          <w:szCs w:val="22"/>
+        </w:rPr>
+        <w:t>Transformationen</w:t>
+      </w:r>
+      <w:r>
+        <w:rPr>
+          <w:rFonts w:ascii="Calibri" w:hAnsi="Calibri" w:cs="Calibri"/>
+          <w:sz w:val="22"/>
+          <w:szCs w:val="22"/>
+        </w:rPr>
+        <w:t xml:space="preserve">, wie Translation, Rotation und Skalierung, als auch durch </w:t>
+      </w:r>
+      <w:r>
+        <w:rPr>
+          <w:rFonts w:ascii="Calibri" w:hAnsi="Calibri" w:cs="Calibri"/>
+          <w:sz w:val="22"/>
+          <w:szCs w:val="22"/>
+        </w:rPr>
+        <w:t>nicht</w:t>
+      </w:r>
+      <w:r>
+        <w:rPr>
+          <w:rFonts w:ascii="Calibri" w:hAnsi="Calibri" w:cs="Calibri"/>
+          <w:sz w:val="22"/>
+          <w:szCs w:val="22"/>
+        </w:rPr>
+        <w:t xml:space="preserve"> s</w:t>
+      </w:r>
+      <w:r>
+        <w:rPr>
+          <w:rFonts w:ascii="Calibri" w:hAnsi="Calibri" w:cs="Calibri"/>
+          <w:sz w:val="22"/>
+          <w:szCs w:val="22"/>
+        </w:rPr>
+        <w:t>tarre Transformationen</w:t>
+      </w:r>
+      <w:r>
+        <w:rPr>
+          <w:rFonts w:ascii="Calibri" w:hAnsi="Calibri" w:cs="Calibri"/>
+          <w:sz w:val="22"/>
+          <w:szCs w:val="22"/>
+        </w:rPr>
+        <w:t>, die Formveränderungen des Auges, beispielsweise durch Augenlidbewegungen oder perspektivische Verzerrungen, berücksichtigen</w:t>
+      </w:r>
+      <w:r>
+        <w:rPr>
+          <w:rFonts w:ascii="Calibri" w:hAnsi="Calibri" w:cs="Calibri"/>
+          <w:sz w:val="22"/>
+          <w:szCs w:val="22"/>
+        </w:rPr>
+        <w:t xml:space="preserve">. Diese Verfahren </w:t>
+      </w:r>
+      <w:r>
+        <w:rPr>
+          <w:rFonts w:ascii="Calibri" w:hAnsi="Calibri" w:cs="Calibri"/>
+          <w:sz w:val="22"/>
+          <w:szCs w:val="22"/>
+        </w:rPr>
+        <w:t>versuchen im Allgemeinen d</w:t>
+      </w:r>
+      <w:r>
+        <w:rPr>
+          <w:rFonts w:ascii="Calibri" w:hAnsi="Calibri" w:cs="Calibri"/>
+          <w:sz w:val="22"/>
+          <w:szCs w:val="22"/>
+        </w:rPr>
+        <w:t>ie vollständige Geometrie des</w:t>
+      </w:r>
+      <w:r>
+        <w:rPr>
+          <w:rFonts w:ascii="Calibri" w:hAnsi="Calibri" w:cs="Calibri"/>
+          <w:sz w:val="22"/>
+          <w:szCs w:val="22"/>
+        </w:rPr>
+        <w:t xml:space="preserve"> Auge</w:t>
+      </w:r>
+      <w:r>
+        <w:rPr>
+          <w:rFonts w:ascii="Calibri" w:hAnsi="Calibri" w:cs="Calibri"/>
+          <w:sz w:val="22"/>
+          <w:szCs w:val="22"/>
+        </w:rPr>
+        <w:t>s</w:t>
+      </w:r>
+      <w:r>
+        <w:rPr>
+          <w:rFonts w:ascii="Calibri" w:hAnsi="Calibri" w:cs="Calibri"/>
+          <w:sz w:val="22"/>
+          <w:szCs w:val="22"/>
+        </w:rPr>
+        <w:t xml:space="preserve"> zu rekonstruieren</w:t>
+      </w:r>
+      <w:r>
+        <w:rPr>
+          <w:rFonts w:ascii="Calibri" w:hAnsi="Calibri" w:cs="Calibri"/>
+          <w:sz w:val="22"/>
+          <w:szCs w:val="22"/>
+        </w:rPr>
+        <w:t>.</w:t>
+      </w:r>
+    </w:p>
+    <w:p>
+      <w:pPr>
+        <w:rPr>
+          <w:rFonts w:ascii="Calibri" w:hAnsi="Calibri" w:cs="Calibri"/>
+          <w:sz w:val="22"/>
+          <w:szCs w:val="22"/>
+        </w:rPr>
+      </w:pPr>
       <w:r>
         <w:rPr>
           <w:rFonts w:ascii="Calibri" w:hAnsi="Calibri" w:cs="Calibri"/>
@@ -1120,27 +1426,7 @@
           <w:sz w:val="22"/>
           <w:szCs w:val="22"/>
         </w:rPr>
-        <w:t>-</w:t>
-      </w:r>
-      <w:proofErr w:type="spellStart"/>
-      <w:r>
-        <w:rPr>
-          <w:rFonts w:ascii="Calibri" w:hAnsi="Calibri" w:cs="Calibri"/>
-          <w:b/>
-          <w:sz w:val="22"/>
-          <w:szCs w:val="22"/>
-        </w:rPr>
-        <w:t>Based</w:t>
-      </w:r>
-      <w:proofErr w:type="spellEnd"/>
-      <w:r>
-        <w:rPr>
-          <w:rFonts w:ascii="Calibri" w:hAnsi="Calibri" w:cs="Calibri"/>
-          <w:b/>
-          <w:sz w:val="22"/>
-          <w:szCs w:val="22"/>
-        </w:rPr>
-        <w:t>-Verfahren</w:t>
+        <w:t>Feature-Based-Verfahren</w:t>
       </w:r>
       <w:r>
         <w:rPr>
@@ -1156,7 +1442,95 @@
           <w:sz w:val="22"/>
           <w:szCs w:val="22"/>
         </w:rPr>
-        <w:t>,</w:t>
+        <w:t xml:space="preserve"> im Gegensatz</w:t>
+      </w:r>
+      <w:r>
+        <w:rPr>
+          <w:rFonts w:ascii="Calibri" w:hAnsi="Calibri" w:cs="Calibri"/>
+          <w:sz w:val="22"/>
+          <w:szCs w:val="22"/>
+        </w:rPr>
+        <w:t xml:space="preserve"> zu Shape-Based-Verfahren</w:t>
+      </w:r>
+      <w:r>
+        <w:rPr>
+          <w:rFonts w:ascii="Calibri" w:hAnsi="Calibri" w:cs="Calibri"/>
+          <w:sz w:val="22"/>
+          <w:szCs w:val="22"/>
+        </w:rPr>
+        <w:t xml:space="preserve"> nur einige, leicht erkennbare Merkmale des Auges. </w:t>
+      </w:r>
+      <w:r>
+        <w:rPr>
+          <w:rFonts w:ascii="Calibri" w:hAnsi="Calibri" w:cs="Calibri"/>
+          <w:sz w:val="22"/>
+          <w:szCs w:val="22"/>
+        </w:rPr>
+        <w:t xml:space="preserve">Zu </w:t>
+      </w:r>
+      <w:r>
+        <w:rPr>
+          <w:rFonts w:ascii="Calibri" w:hAnsi="Calibri" w:cs="Calibri"/>
+          <w:sz w:val="22"/>
+          <w:szCs w:val="22"/>
+        </w:rPr>
+        <w:t xml:space="preserve">den </w:t>
+      </w:r>
+      <w:r>
+        <w:rPr>
+          <w:rFonts w:ascii="Calibri" w:hAnsi="Calibri" w:cs="Calibri"/>
+          <w:sz w:val="22"/>
+          <w:szCs w:val="22"/>
+        </w:rPr>
+        <w:t>Merkmalen zählen unter anderem der</w:t>
+      </w:r>
+      <w:r>
+        <w:rPr>
+          <w:rFonts w:ascii="Calibri" w:hAnsi="Calibri" w:cs="Calibri"/>
+          <w:sz w:val="22"/>
+          <w:szCs w:val="22"/>
+        </w:rPr>
+        <w:t xml:space="preserve"> Limbus,</w:t>
+      </w:r>
+      <w:r>
+        <w:rPr>
+          <w:rFonts w:ascii="Calibri" w:hAnsi="Calibri" w:cs="Calibri"/>
+          <w:sz w:val="22"/>
+          <w:szCs w:val="22"/>
+        </w:rPr>
+        <w:t xml:space="preserve"> das</w:t>
+      </w:r>
+      <w:r>
+        <w:rPr>
+          <w:rFonts w:ascii="Calibri" w:hAnsi="Calibri" w:cs="Calibri"/>
+          <w:sz w:val="22"/>
+          <w:szCs w:val="22"/>
+        </w:rPr>
+        <w:t xml:space="preserve"> Pupillenzentrum, Hornhautreflexion</w:t>
+      </w:r>
+      <w:r>
+        <w:rPr>
+          <w:rFonts w:ascii="Calibri" w:hAnsi="Calibri" w:cs="Calibri"/>
+          <w:sz w:val="22"/>
+          <w:szCs w:val="22"/>
+        </w:rPr>
+        <w:t>en</w:t>
+      </w:r>
+      <w:r>
+        <w:rPr>
+          <w:rFonts w:ascii="Calibri" w:hAnsi="Calibri" w:cs="Calibri"/>
+          <w:sz w:val="22"/>
+          <w:szCs w:val="22"/>
+        </w:rPr>
+        <w:t xml:space="preserve">, </w:t>
+      </w:r>
+      <w:r>
+        <w:rPr>
+          <w:rFonts w:ascii="Calibri" w:hAnsi="Calibri" w:cs="Calibri"/>
+          <w:sz w:val="22"/>
+          <w:szCs w:val="22"/>
+        </w:rPr>
+        <w:t>sowie</w:t>
       </w:r>
       <w:r>
         <w:rPr>
@@ -1172,74 +1546,56 @@
           <w:sz w:val="22"/>
           <w:szCs w:val="22"/>
         </w:rPr>
-        <w:t>neben dem</w:t>
-      </w:r>
-      <w:r>
-        <w:rPr>
-          <w:rFonts w:ascii="Calibri" w:hAnsi="Calibri" w:cs="Calibri"/>
-          <w:sz w:val="22"/>
-          <w:szCs w:val="22"/>
-        </w:rPr>
-        <w:t xml:space="preserve"> geometrische</w:t>
-      </w:r>
-      <w:r>
-        <w:rPr>
-          <w:rFonts w:ascii="Calibri" w:hAnsi="Calibri" w:cs="Calibri"/>
-          <w:sz w:val="22"/>
-          <w:szCs w:val="22"/>
-        </w:rPr>
-        <w:t>m</w:t>
-      </w:r>
-      <w:r>
-        <w:rPr>
-          <w:rFonts w:ascii="Calibri" w:hAnsi="Calibri" w:cs="Calibri"/>
-          <w:sz w:val="22"/>
-          <w:szCs w:val="22"/>
-        </w:rPr>
-        <w:t xml:space="preserve"> Augenmodell</w:t>
-      </w:r>
-      <w:r>
-        <w:rPr>
-          <w:rFonts w:ascii="Calibri" w:hAnsi="Calibri" w:cs="Calibri"/>
-          <w:sz w:val="22"/>
-          <w:szCs w:val="22"/>
-        </w:rPr>
-        <w:t xml:space="preserve">, </w:t>
-      </w:r>
-      <w:r>
-        <w:rPr>
-          <w:rFonts w:ascii="Calibri" w:hAnsi="Calibri" w:cs="Calibri"/>
-          <w:sz w:val="22"/>
-          <w:szCs w:val="22"/>
-        </w:rPr>
-        <w:t xml:space="preserve">zusätzlich </w:t>
-      </w:r>
-      <w:r>
-        <w:rPr>
-          <w:rFonts w:ascii="Calibri" w:hAnsi="Calibri" w:cs="Calibri"/>
-          <w:sz w:val="22"/>
-          <w:szCs w:val="22"/>
-        </w:rPr>
-        <w:t>ein Ähnlichkeitsmaß</w:t>
-      </w:r>
-      <w:r>
-        <w:rPr>
-          <w:rFonts w:ascii="Calibri" w:hAnsi="Calibri" w:cs="Calibri"/>
-          <w:sz w:val="22"/>
-          <w:szCs w:val="22"/>
-        </w:rPr>
-        <w:t xml:space="preserve"> (</w:t>
-      </w:r>
-      <w:proofErr w:type="spellStart"/>
-      <w:r>
-        <w:rPr>
-          <w:rFonts w:ascii="Calibri" w:hAnsi="Calibri" w:cs="Calibri"/>
-          <w:sz w:val="22"/>
-          <w:szCs w:val="22"/>
-        </w:rPr>
-        <w:t>Similarity</w:t>
-      </w:r>
-      <w:proofErr w:type="spellEnd"/>
+        <w:t xml:space="preserve">die </w:t>
+      </w:r>
+      <w:r>
+        <w:rPr>
+          <w:rFonts w:ascii="Calibri" w:hAnsi="Calibri" w:cs="Calibri"/>
+          <w:sz w:val="22"/>
+          <w:szCs w:val="22"/>
+        </w:rPr>
+        <w:t xml:space="preserve">Augenwinkel und </w:t>
+      </w:r>
+      <w:r>
+        <w:rPr>
+          <w:rFonts w:ascii="Calibri" w:hAnsi="Calibri" w:cs="Calibri"/>
+          <w:sz w:val="22"/>
+          <w:szCs w:val="22"/>
+        </w:rPr>
+        <w:t xml:space="preserve">die </w:t>
+      </w:r>
+      <w:r>
+        <w:rPr>
+          <w:rFonts w:ascii="Calibri" w:hAnsi="Calibri" w:cs="Calibri"/>
+          <w:sz w:val="22"/>
+          <w:szCs w:val="22"/>
+        </w:rPr>
+        <w:t>Augenmitte.</w:t>
+      </w:r>
+      <w:r>
+        <w:rPr>
+          <w:rFonts w:ascii="Calibri" w:hAnsi="Calibri" w:cs="Calibri"/>
+          <w:sz w:val="22"/>
+          <w:szCs w:val="22"/>
+        </w:rPr>
+        <w:t xml:space="preserve"> Nach der Detektion der Merkmale werden deren relative Positionen und Abstände zueinander bestimmt, um die Blickrichtung zu schätzen. </w:t>
+      </w:r>
+      <w:r>
+        <w:rPr>
+          <w:rFonts w:ascii="Calibri" w:hAnsi="Calibri" w:cs="Calibri"/>
+          <w:sz w:val="22"/>
+          <w:szCs w:val="22"/>
+        </w:rPr>
+        <w:t>Ein</w:t>
+      </w:r>
+      <w:r>
+        <w:rPr>
+          <w:rFonts w:ascii="Calibri" w:hAnsi="Calibri" w:cs="Calibri"/>
+          <w:sz w:val="22"/>
+          <w:szCs w:val="22"/>
+        </w:rPr>
+        <w:t xml:space="preserve"> bekanntes</w:t>
+      </w:r>
       <w:r>
         <w:rPr>
           <w:rFonts w:ascii="Calibri" w:hAnsi="Calibri" w:cs="Calibri"/>
@@ -1248,63 +1604,45 @@
         </w:rPr>
         <w:t xml:space="preserve"> </w:t>
       </w:r>
-      <w:proofErr w:type="spellStart"/>
-      <w:r>
-        <w:rPr>
-          <w:rFonts w:ascii="Calibri" w:hAnsi="Calibri" w:cs="Calibri"/>
-          <w:sz w:val="22"/>
-          <w:szCs w:val="22"/>
-        </w:rPr>
-        <w:t>Measure</w:t>
-      </w:r>
-      <w:proofErr w:type="spellEnd"/>
-      <w:r>
-        <w:rPr>
-          <w:rFonts w:ascii="Calibri" w:hAnsi="Calibri" w:cs="Calibri"/>
-          <w:sz w:val="22"/>
-          <w:szCs w:val="22"/>
-        </w:rPr>
-        <w:t>)</w:t>
-      </w:r>
-      <w:r>
-        <w:rPr>
-          <w:rFonts w:ascii="Calibri" w:hAnsi="Calibri" w:cs="Calibri"/>
-          <w:sz w:val="22"/>
-          <w:szCs w:val="22"/>
-        </w:rPr>
-        <w:t>, um das Modell an die Bilddaten anzupassen.</w:t>
-      </w:r>
-      <w:r>
-        <w:rPr>
-          <w:rFonts w:ascii="Calibri" w:hAnsi="Calibri" w:cs="Calibri"/>
-          <w:sz w:val="22"/>
-          <w:szCs w:val="22"/>
-        </w:rPr>
-        <w:t xml:space="preserve"> Hierzu werden die Parameter des Augenmodells iterativ verändert, bis eine möglichst hohe Übereinstimmung zwischen Modell und beobachtetem Auge im Bild erreicht wird. </w:t>
-      </w:r>
-      <w:r>
-        <w:rPr>
-          <w:rFonts w:ascii="Calibri" w:hAnsi="Calibri" w:cs="Calibri"/>
-          <w:sz w:val="22"/>
-          <w:szCs w:val="22"/>
-        </w:rPr>
-        <w:t xml:space="preserve">Die Anpassung </w:t>
-      </w:r>
-      <w:r>
-        <w:rPr>
-          <w:rFonts w:ascii="Calibri" w:hAnsi="Calibri" w:cs="Calibri"/>
-          <w:sz w:val="22"/>
-          <w:szCs w:val="22"/>
-        </w:rPr>
-        <w:t>erfolgt sowohl</w:t>
-      </w:r>
-      <w:r>
-        <w:rPr>
-          <w:rFonts w:ascii="Calibri" w:hAnsi="Calibri" w:cs="Calibri"/>
-          <w:sz w:val="22"/>
-          <w:szCs w:val="22"/>
-        </w:rPr>
-        <w:t xml:space="preserve"> durch starre</w:t>
+      <w:r>
+        <w:rPr>
+          <w:rFonts w:ascii="Calibri" w:hAnsi="Calibri" w:cs="Calibri"/>
+          <w:sz w:val="22"/>
+          <w:szCs w:val="22"/>
+        </w:rPr>
+        <w:t xml:space="preserve">Beispiel </w:t>
+      </w:r>
+      <w:r>
+        <w:rPr>
+          <w:rFonts w:ascii="Calibri" w:hAnsi="Calibri" w:cs="Calibri"/>
+          <w:sz w:val="22"/>
+          <w:szCs w:val="22"/>
+        </w:rPr>
+        <w:t>stellt</w:t>
+      </w:r>
+      <w:r>
+        <w:rPr>
+          <w:rFonts w:ascii="Calibri" w:hAnsi="Calibri" w:cs="Calibri"/>
+          <w:sz w:val="22"/>
+          <w:szCs w:val="22"/>
+        </w:rPr>
+        <w:t xml:space="preserve"> die Hornhautreflexion</w:t>
+      </w:r>
+      <w:r>
+        <w:rPr>
+          <w:rFonts w:ascii="Calibri" w:hAnsi="Calibri" w:cs="Calibri"/>
+          <w:sz w:val="22"/>
+          <w:szCs w:val="22"/>
+        </w:rPr>
+        <w:t>s-Methode</w:t>
+      </w:r>
+      <w:r>
+        <w:rPr>
+          <w:rFonts w:ascii="Calibri" w:hAnsi="Calibri" w:cs="Calibri"/>
+          <w:sz w:val="22"/>
+          <w:szCs w:val="22"/>
+        </w:rPr>
+        <w:t xml:space="preserve"> dar.</w:t>
       </w:r>
       <w:r>
         <w:rPr>
@@ -1314,103 +1652,53 @@
         </w:rPr>
         <w:t xml:space="preserve"> </w:t>
       </w:r>
-      <w:proofErr w:type="gramStart"/>
-      <w:r>
-        <w:rPr>
-          <w:rFonts w:ascii="Calibri" w:hAnsi="Calibri" w:cs="Calibri"/>
-          <w:sz w:val="22"/>
-          <w:szCs w:val="22"/>
-        </w:rPr>
-        <w:t>Transformationen,</w:t>
-      </w:r>
-      <w:proofErr w:type="gramEnd"/>
-      <w:r>
-        <w:rPr>
-          <w:rFonts w:ascii="Calibri" w:hAnsi="Calibri" w:cs="Calibri"/>
-          <w:sz w:val="22"/>
-          <w:szCs w:val="22"/>
-        </w:rPr>
-        <w:t xml:space="preserve"> wie Translation, Rotation und Skalierung, als auch durch </w:t>
-      </w:r>
-      <w:r>
-        <w:rPr>
-          <w:rFonts w:ascii="Calibri" w:hAnsi="Calibri" w:cs="Calibri"/>
-          <w:sz w:val="22"/>
-          <w:szCs w:val="22"/>
-        </w:rPr>
-        <w:t>nicht</w:t>
-      </w:r>
-      <w:r>
-        <w:rPr>
-          <w:rFonts w:ascii="Calibri" w:hAnsi="Calibri" w:cs="Calibri"/>
-          <w:sz w:val="22"/>
-          <w:szCs w:val="22"/>
-        </w:rPr>
-        <w:t xml:space="preserve"> s</w:t>
-      </w:r>
-      <w:r>
-        <w:rPr>
-          <w:rFonts w:ascii="Calibri" w:hAnsi="Calibri" w:cs="Calibri"/>
-          <w:sz w:val="22"/>
-          <w:szCs w:val="22"/>
-        </w:rPr>
-        <w:t>tarre Transformationen</w:t>
-      </w:r>
-      <w:r>
-        <w:rPr>
-          <w:rFonts w:ascii="Calibri" w:hAnsi="Calibri" w:cs="Calibri"/>
-          <w:sz w:val="22"/>
-          <w:szCs w:val="22"/>
-        </w:rPr>
-        <w:t>, die Formveränderungen des Auges, beispielsweise durch Augenlidbewegungen oder perspektivische Verzerrungen, berücksichtigen</w:t>
-      </w:r>
-      <w:r>
-        <w:rPr>
-          <w:rFonts w:ascii="Calibri" w:hAnsi="Calibri" w:cs="Calibri"/>
-          <w:sz w:val="22"/>
-          <w:szCs w:val="22"/>
-        </w:rPr>
-        <w:t xml:space="preserve">. Diese Verfahren </w:t>
-      </w:r>
-      <w:r>
-        <w:rPr>
-          <w:rFonts w:ascii="Calibri" w:hAnsi="Calibri" w:cs="Calibri"/>
-          <w:sz w:val="22"/>
-          <w:szCs w:val="22"/>
-        </w:rPr>
-        <w:t>versuchen im Allgemeinen d</w:t>
-      </w:r>
-      <w:r>
-        <w:rPr>
-          <w:rFonts w:ascii="Calibri" w:hAnsi="Calibri" w:cs="Calibri"/>
-          <w:sz w:val="22"/>
-          <w:szCs w:val="22"/>
-        </w:rPr>
-        <w:t>ie vollständige Geometrie des</w:t>
-      </w:r>
-      <w:r>
-        <w:rPr>
-          <w:rFonts w:ascii="Calibri" w:hAnsi="Calibri" w:cs="Calibri"/>
-          <w:sz w:val="22"/>
-          <w:szCs w:val="22"/>
-        </w:rPr>
-        <w:t xml:space="preserve"> Auge</w:t>
-      </w:r>
-      <w:r>
-        <w:rPr>
-          <w:rFonts w:ascii="Calibri" w:hAnsi="Calibri" w:cs="Calibri"/>
-          <w:sz w:val="22"/>
-          <w:szCs w:val="22"/>
-        </w:rPr>
-        <w:t>s</w:t>
-      </w:r>
-      <w:r>
-        <w:rPr>
-          <w:rFonts w:ascii="Calibri" w:hAnsi="Calibri" w:cs="Calibri"/>
-          <w:sz w:val="22"/>
-          <w:szCs w:val="22"/>
-        </w:rPr>
-        <w:t xml:space="preserve"> zu rekonstruieren</w:t>
+      <w:r>
+        <w:rPr>
+          <w:rFonts w:ascii="Calibri" w:hAnsi="Calibri" w:cs="Calibri"/>
+          <w:sz w:val="22"/>
+          <w:szCs w:val="22"/>
+        </w:rPr>
+        <w:t>Da</w:t>
+      </w:r>
+      <w:r>
+        <w:rPr>
+          <w:rFonts w:ascii="Calibri" w:hAnsi="Calibri" w:cs="Calibri"/>
+          <w:sz w:val="22"/>
+          <w:szCs w:val="22"/>
+        </w:rPr>
+        <w:t xml:space="preserve">bei </w:t>
+      </w:r>
+      <w:r>
+        <w:rPr>
+          <w:rFonts w:ascii="Calibri" w:hAnsi="Calibri" w:cs="Calibri"/>
+          <w:sz w:val="22"/>
+          <w:szCs w:val="22"/>
+        </w:rPr>
+        <w:t>erzeugt e</w:t>
+      </w:r>
+      <w:r>
+        <w:rPr>
+          <w:rFonts w:ascii="Calibri" w:hAnsi="Calibri" w:cs="Calibri"/>
+          <w:sz w:val="22"/>
+          <w:szCs w:val="22"/>
+        </w:rPr>
+        <w:t xml:space="preserve">ine </w:t>
+      </w:r>
+      <w:r>
+        <w:rPr>
+          <w:rFonts w:ascii="Calibri" w:hAnsi="Calibri" w:cs="Calibri"/>
+          <w:sz w:val="22"/>
+          <w:szCs w:val="22"/>
+        </w:rPr>
+        <w:t>Infrarot-</w:t>
+      </w:r>
+      <w:r>
+        <w:rPr>
+          <w:rFonts w:ascii="Calibri" w:hAnsi="Calibri" w:cs="Calibri"/>
+          <w:sz w:val="22"/>
+          <w:szCs w:val="22"/>
+        </w:rPr>
+        <w:t>Lichtquelle Reflexionspunkte auf der Hornhaut, sogenannte Glints</w:t>
       </w:r>
       <w:r>
         <w:rPr>
@@ -1420,150 +1708,6 @@
         </w:rPr>
         <w:t>.</w:t>
       </w:r>
-    </w:p>
-    <w:p>
-      <w:pPr>
-        <w:rPr>
-          <w:rFonts w:ascii="Calibri" w:hAnsi="Calibri" w:cs="Calibri"/>
-          <w:sz w:val="22"/>
-          <w:szCs w:val="22"/>
-        </w:rPr>
-      </w:pPr>
-      <w:r>
-        <w:rPr>
-          <w:rFonts w:ascii="Calibri" w:hAnsi="Calibri" w:cs="Calibri"/>
-          <w:b/>
-          <w:sz w:val="22"/>
-          <w:szCs w:val="22"/>
-        </w:rPr>
-        <w:t>Feature-</w:t>
-      </w:r>
-      <w:proofErr w:type="spellStart"/>
-      <w:r>
-        <w:rPr>
-          <w:rFonts w:ascii="Calibri" w:hAnsi="Calibri" w:cs="Calibri"/>
-          <w:b/>
-          <w:sz w:val="22"/>
-          <w:szCs w:val="22"/>
-        </w:rPr>
-        <w:t>Based</w:t>
-      </w:r>
-      <w:proofErr w:type="spellEnd"/>
-      <w:r>
-        <w:rPr>
-          <w:rFonts w:ascii="Calibri" w:hAnsi="Calibri" w:cs="Calibri"/>
-          <w:b/>
-          <w:sz w:val="22"/>
-          <w:szCs w:val="22"/>
-        </w:rPr>
-        <w:t>-Verfahren</w:t>
-      </w:r>
-      <w:r>
-        <w:rPr>
-          <w:rFonts w:ascii="Calibri" w:hAnsi="Calibri" w:cs="Calibri"/>
-          <w:sz w:val="22"/>
-          <w:szCs w:val="22"/>
-        </w:rPr>
-        <w:t xml:space="preserve"> verwenden</w:t>
-      </w:r>
-      <w:r>
-        <w:rPr>
-          <w:rFonts w:ascii="Calibri" w:hAnsi="Calibri" w:cs="Calibri"/>
-          <w:sz w:val="22"/>
-          <w:szCs w:val="22"/>
-        </w:rPr>
-        <w:t xml:space="preserve"> im Gegensatz</w:t>
-      </w:r>
-      <w:r>
-        <w:rPr>
-          <w:rFonts w:ascii="Calibri" w:hAnsi="Calibri" w:cs="Calibri"/>
-          <w:sz w:val="22"/>
-          <w:szCs w:val="22"/>
-        </w:rPr>
-        <w:t xml:space="preserve"> zu Shape-</w:t>
-      </w:r>
-      <w:proofErr w:type="spellStart"/>
-      <w:r>
-        <w:rPr>
-          <w:rFonts w:ascii="Calibri" w:hAnsi="Calibri" w:cs="Calibri"/>
-          <w:sz w:val="22"/>
-          <w:szCs w:val="22"/>
-        </w:rPr>
-        <w:t>Based</w:t>
-      </w:r>
-      <w:proofErr w:type="spellEnd"/>
-      <w:r>
-        <w:rPr>
-          <w:rFonts w:ascii="Calibri" w:hAnsi="Calibri" w:cs="Calibri"/>
-          <w:sz w:val="22"/>
-          <w:szCs w:val="22"/>
-        </w:rPr>
-        <w:t>-Verfahren</w:t>
-      </w:r>
-      <w:r>
-        <w:rPr>
-          <w:rFonts w:ascii="Calibri" w:hAnsi="Calibri" w:cs="Calibri"/>
-          <w:sz w:val="22"/>
-          <w:szCs w:val="22"/>
-        </w:rPr>
-        <w:t xml:space="preserve"> nur einige, leicht erkennbare Merkmale des Auges. </w:t>
-      </w:r>
-      <w:r>
-        <w:rPr>
-          <w:rFonts w:ascii="Calibri" w:hAnsi="Calibri" w:cs="Calibri"/>
-          <w:sz w:val="22"/>
-          <w:szCs w:val="22"/>
-        </w:rPr>
-        <w:t>Zu Merkmalen zählen unter anderem der</w:t>
-      </w:r>
-      <w:r>
-        <w:rPr>
-          <w:rFonts w:ascii="Calibri" w:hAnsi="Calibri" w:cs="Calibri"/>
-          <w:sz w:val="22"/>
-          <w:szCs w:val="22"/>
-        </w:rPr>
-        <w:t xml:space="preserve"> Limbus,</w:t>
-      </w:r>
-      <w:r>
-        <w:rPr>
-          <w:rFonts w:ascii="Calibri" w:hAnsi="Calibri" w:cs="Calibri"/>
-          <w:sz w:val="22"/>
-          <w:szCs w:val="22"/>
-        </w:rPr>
-        <w:t xml:space="preserve"> das</w:t>
-      </w:r>
-      <w:r>
-        <w:rPr>
-          <w:rFonts w:ascii="Calibri" w:hAnsi="Calibri" w:cs="Calibri"/>
-          <w:sz w:val="22"/>
-          <w:szCs w:val="22"/>
-        </w:rPr>
-        <w:t xml:space="preserve"> Pupillenzentrum, Hornhautreflexion</w:t>
-      </w:r>
-      <w:r>
-        <w:rPr>
-          <w:rFonts w:ascii="Calibri" w:hAnsi="Calibri" w:cs="Calibri"/>
-          <w:sz w:val="22"/>
-          <w:szCs w:val="22"/>
-        </w:rPr>
-        <w:t>en</w:t>
-      </w:r>
-      <w:r>
-        <w:rPr>
-          <w:rFonts w:ascii="Calibri" w:hAnsi="Calibri" w:cs="Calibri"/>
-          <w:sz w:val="22"/>
-          <w:szCs w:val="22"/>
-        </w:rPr>
-        <w:t xml:space="preserve">, </w:t>
-      </w:r>
-      <w:r>
-        <w:rPr>
-          <w:rFonts w:ascii="Calibri" w:hAnsi="Calibri" w:cs="Calibri"/>
-          <w:sz w:val="22"/>
-          <w:szCs w:val="22"/>
-        </w:rPr>
-        <w:t>sowie</w:t>
-      </w:r>
       <w:r>
         <w:rPr>
           <w:rFonts w:ascii="Calibri" w:hAnsi="Calibri" w:cs="Calibri"/>
@@ -1578,79 +1722,23 @@
           <w:sz w:val="22"/>
           <w:szCs w:val="22"/>
         </w:rPr>
-        <w:t xml:space="preserve">die </w:t>
-      </w:r>
-      <w:r>
-        <w:rPr>
-          <w:rFonts w:ascii="Calibri" w:hAnsi="Calibri" w:cs="Calibri"/>
-          <w:sz w:val="22"/>
-          <w:szCs w:val="22"/>
-        </w:rPr>
-        <w:t>Augenwinkel</w:t>
-      </w:r>
-      <w:r>
-        <w:rPr>
-          <w:rFonts w:ascii="Calibri" w:hAnsi="Calibri" w:cs="Calibri"/>
-          <w:sz w:val="22"/>
-          <w:szCs w:val="22"/>
-        </w:rPr>
-        <w:t xml:space="preserve"> und </w:t>
-      </w:r>
-      <w:r>
-        <w:rPr>
-          <w:rFonts w:ascii="Calibri" w:hAnsi="Calibri" w:cs="Calibri"/>
-          <w:sz w:val="22"/>
-          <w:szCs w:val="22"/>
-        </w:rPr>
-        <w:t xml:space="preserve">die </w:t>
-      </w:r>
-      <w:r>
-        <w:rPr>
-          <w:rFonts w:ascii="Calibri" w:hAnsi="Calibri" w:cs="Calibri"/>
-          <w:sz w:val="22"/>
-          <w:szCs w:val="22"/>
-        </w:rPr>
-        <w:t>Augenmitte.</w:t>
-      </w:r>
-      <w:r>
-        <w:rPr>
-          <w:rFonts w:ascii="Calibri" w:hAnsi="Calibri" w:cs="Calibri"/>
-          <w:sz w:val="22"/>
-          <w:szCs w:val="22"/>
-        </w:rPr>
-        <w:t xml:space="preserve"> Nach der Detektion der Merkmale werden deren relative Positionen und </w:t>
-      </w:r>
-      <w:r>
-        <w:rPr>
-          <w:rFonts w:ascii="Calibri" w:hAnsi="Calibri" w:cs="Calibri"/>
-          <w:sz w:val="22"/>
-          <w:szCs w:val="22"/>
-        </w:rPr>
-        <w:t>Abstände</w:t>
-      </w:r>
-      <w:r>
-        <w:rPr>
-          <w:rFonts w:ascii="Calibri" w:hAnsi="Calibri" w:cs="Calibri"/>
-          <w:sz w:val="22"/>
-          <w:szCs w:val="22"/>
-        </w:rPr>
-        <w:t xml:space="preserve"> zueinander bestimmt, um die Blickrichtung zu schätzen. </w:t>
-      </w:r>
-      <w:r>
-        <w:rPr>
-          <w:rFonts w:ascii="Calibri" w:hAnsi="Calibri" w:cs="Calibri"/>
-          <w:sz w:val="22"/>
-          <w:szCs w:val="22"/>
-        </w:rPr>
-        <w:t>Ein</w:t>
-      </w:r>
-      <w:r>
-        <w:rPr>
-          <w:rFonts w:ascii="Calibri" w:hAnsi="Calibri" w:cs="Calibri"/>
-          <w:sz w:val="22"/>
-          <w:szCs w:val="22"/>
-        </w:rPr>
-        <w:t xml:space="preserve"> bekanntes</w:t>
+        <w:t>Aus der</w:t>
+      </w:r>
+      <w:r>
+        <w:rPr>
+          <w:rFonts w:ascii="Calibri" w:hAnsi="Calibri" w:cs="Calibri"/>
+          <w:sz w:val="22"/>
+          <w:szCs w:val="22"/>
+        </w:rPr>
+        <w:t xml:space="preserve"> relative</w:t>
+      </w:r>
+      <w:r>
+        <w:rPr>
+          <w:rFonts w:ascii="Calibri" w:hAnsi="Calibri" w:cs="Calibri"/>
+          <w:sz w:val="22"/>
+          <w:szCs w:val="22"/>
+        </w:rPr>
+        <w:t>n</w:t>
       </w:r>
       <w:r>
         <w:rPr>
@@ -1666,82 +1754,40 @@
           <w:sz w:val="22"/>
           <w:szCs w:val="22"/>
         </w:rPr>
-        <w:t xml:space="preserve">Beispiel </w:t>
-      </w:r>
-      <w:r>
-        <w:rPr>
-          <w:rFonts w:ascii="Calibri" w:hAnsi="Calibri" w:cs="Calibri"/>
-          <w:sz w:val="22"/>
-          <w:szCs w:val="22"/>
-        </w:rPr>
-        <w:t>stellt</w:t>
-      </w:r>
-      <w:r>
-        <w:rPr>
-          <w:rFonts w:ascii="Calibri" w:hAnsi="Calibri" w:cs="Calibri"/>
-          <w:sz w:val="22"/>
-          <w:szCs w:val="22"/>
-        </w:rPr>
-        <w:t xml:space="preserve"> die Verwendung von Hornhautreflexionen</w:t>
-      </w:r>
-      <w:r>
-        <w:rPr>
-          <w:rFonts w:ascii="Calibri" w:hAnsi="Calibri" w:cs="Calibri"/>
-          <w:sz w:val="22"/>
-          <w:szCs w:val="22"/>
-        </w:rPr>
-        <w:t xml:space="preserve"> dar.</w:t>
-      </w:r>
-      <w:r>
-        <w:rPr>
-          <w:rFonts w:ascii="Calibri" w:hAnsi="Calibri" w:cs="Calibri"/>
-          <w:sz w:val="22"/>
-          <w:szCs w:val="22"/>
-        </w:rPr>
-        <w:t xml:space="preserve"> </w:t>
-      </w:r>
-      <w:r>
-        <w:rPr>
-          <w:rFonts w:ascii="Calibri" w:hAnsi="Calibri" w:cs="Calibri"/>
-          <w:sz w:val="22"/>
-          <w:szCs w:val="22"/>
-        </w:rPr>
-        <w:t>Da</w:t>
-      </w:r>
-      <w:r>
-        <w:rPr>
-          <w:rFonts w:ascii="Calibri" w:hAnsi="Calibri" w:cs="Calibri"/>
-          <w:sz w:val="22"/>
-          <w:szCs w:val="22"/>
-        </w:rPr>
-        <w:t xml:space="preserve">bei </w:t>
-      </w:r>
-      <w:r>
-        <w:rPr>
-          <w:rFonts w:ascii="Calibri" w:hAnsi="Calibri" w:cs="Calibri"/>
-          <w:sz w:val="22"/>
-          <w:szCs w:val="22"/>
-        </w:rPr>
-        <w:t>erzeugt e</w:t>
-      </w:r>
-      <w:r>
-        <w:rPr>
-          <w:rFonts w:ascii="Calibri" w:hAnsi="Calibri" w:cs="Calibri"/>
-          <w:sz w:val="22"/>
-          <w:szCs w:val="22"/>
-        </w:rPr>
-        <w:t xml:space="preserve">ine Lichtquelle Reflexionspunkte auf der Hornhaut, sogenannte </w:t>
-      </w:r>
-      <w:proofErr w:type="spellStart"/>
-      <w:r>
-        <w:rPr>
-          <w:rFonts w:ascii="Calibri" w:hAnsi="Calibri" w:cs="Calibri"/>
-          <w:sz w:val="22"/>
-          <w:szCs w:val="22"/>
-        </w:rPr>
-        <w:t>Glints</w:t>
-      </w:r>
-      <w:proofErr w:type="spellEnd"/>
+        <w:t>Lage der Glints</w:t>
+      </w:r>
+      <w:r>
+        <w:rPr>
+          <w:rFonts w:ascii="Calibri" w:hAnsi="Calibri" w:cs="Calibri"/>
+          <w:sz w:val="22"/>
+          <w:szCs w:val="22"/>
+        </w:rPr>
+        <w:t xml:space="preserve"> zum Pupillenzentrum</w:t>
+      </w:r>
+      <w:r>
+        <w:rPr>
+          <w:rFonts w:ascii="Calibri" w:hAnsi="Calibri" w:cs="Calibri"/>
+          <w:sz w:val="22"/>
+          <w:szCs w:val="22"/>
+        </w:rPr>
+        <w:t xml:space="preserve"> kann anschließend</w:t>
+      </w:r>
+      <w:r>
+        <w:rPr>
+          <w:rFonts w:ascii="Calibri" w:hAnsi="Calibri" w:cs="Calibri"/>
+          <w:sz w:val="22"/>
+          <w:szCs w:val="22"/>
+        </w:rPr>
+        <w:t xml:space="preserve"> eine Blickrichtung </w:t>
+      </w:r>
+      <w:r>
+        <w:rPr>
+          <w:rFonts w:ascii="Calibri" w:hAnsi="Calibri" w:cs="Calibri"/>
+          <w:sz w:val="22"/>
+          <w:szCs w:val="22"/>
+        </w:rPr>
+        <w:t>berechnet werden</w:t>
+      </w:r>
       <w:r>
         <w:rPr>
           <w:rFonts w:ascii="Calibri" w:hAnsi="Calibri" w:cs="Calibri"/>
@@ -1750,113 +1796,6 @@
         </w:rPr>
         <w:t>.</w:t>
       </w:r>
-      <w:r>
-        <w:rPr>
-          <w:rFonts w:ascii="Calibri" w:hAnsi="Calibri" w:cs="Calibri"/>
-          <w:sz w:val="22"/>
-          <w:szCs w:val="22"/>
-        </w:rPr>
-        <w:t xml:space="preserve"> </w:t>
-      </w:r>
-      <w:r>
-        <w:rPr>
-          <w:rFonts w:ascii="Calibri" w:hAnsi="Calibri" w:cs="Calibri"/>
-          <w:sz w:val="22"/>
-          <w:szCs w:val="22"/>
-        </w:rPr>
-        <w:t>Aus der</w:t>
-      </w:r>
-      <w:r>
-        <w:rPr>
-          <w:rFonts w:ascii="Calibri" w:hAnsi="Calibri" w:cs="Calibri"/>
-          <w:sz w:val="22"/>
-          <w:szCs w:val="22"/>
-        </w:rPr>
-        <w:t xml:space="preserve"> relative</w:t>
-      </w:r>
-      <w:r>
-        <w:rPr>
-          <w:rFonts w:ascii="Calibri" w:hAnsi="Calibri" w:cs="Calibri"/>
-          <w:sz w:val="22"/>
-          <w:szCs w:val="22"/>
-        </w:rPr>
-        <w:t>n</w:t>
-      </w:r>
-      <w:r>
-        <w:rPr>
-          <w:rFonts w:ascii="Calibri" w:hAnsi="Calibri" w:cs="Calibri"/>
-          <w:sz w:val="22"/>
-          <w:szCs w:val="22"/>
-        </w:rPr>
-        <w:t xml:space="preserve"> </w:t>
-      </w:r>
-      <w:r>
-        <w:rPr>
-          <w:rFonts w:ascii="Calibri" w:hAnsi="Calibri" w:cs="Calibri"/>
-          <w:sz w:val="22"/>
-          <w:szCs w:val="22"/>
-        </w:rPr>
-        <w:t xml:space="preserve">Lage der </w:t>
-      </w:r>
-      <w:proofErr w:type="spellStart"/>
-      <w:r>
-        <w:rPr>
-          <w:rFonts w:ascii="Calibri" w:hAnsi="Calibri" w:cs="Calibri"/>
-          <w:sz w:val="22"/>
-          <w:szCs w:val="22"/>
-        </w:rPr>
-        <w:t>Glints</w:t>
-      </w:r>
-      <w:proofErr w:type="spellEnd"/>
-      <w:r>
-        <w:rPr>
-          <w:rFonts w:ascii="Calibri" w:hAnsi="Calibri" w:cs="Calibri"/>
-          <w:sz w:val="22"/>
-          <w:szCs w:val="22"/>
-        </w:rPr>
-        <w:t xml:space="preserve"> zum Pupillenzentrum</w:t>
-      </w:r>
-      <w:r>
-        <w:rPr>
-          <w:rFonts w:ascii="Calibri" w:hAnsi="Calibri" w:cs="Calibri"/>
-          <w:sz w:val="22"/>
-          <w:szCs w:val="22"/>
-        </w:rPr>
-        <w:t xml:space="preserve"> kann anschließend</w:t>
-      </w:r>
-      <w:r>
-        <w:rPr>
-          <w:rFonts w:ascii="Calibri" w:hAnsi="Calibri" w:cs="Calibri"/>
-          <w:sz w:val="22"/>
-          <w:szCs w:val="22"/>
-        </w:rPr>
-        <w:t xml:space="preserve"> eine Blickrichtung </w:t>
-      </w:r>
-      <w:r>
-        <w:rPr>
-          <w:rFonts w:ascii="Calibri" w:hAnsi="Calibri" w:cs="Calibri"/>
-          <w:sz w:val="22"/>
-          <w:szCs w:val="22"/>
-        </w:rPr>
-        <w:t>berechnet werden</w:t>
-      </w:r>
-      <w:r>
-        <w:rPr>
-          <w:rFonts w:ascii="Calibri" w:hAnsi="Calibri" w:cs="Calibri"/>
-          <w:sz w:val="22"/>
-          <w:szCs w:val="22"/>
-        </w:rPr>
-        <w:t>.</w:t>
-      </w:r>
-    </w:p>
-    <w:p>
-      <w:pPr>
-        <w:rPr>
-          <w:rFonts w:ascii="Calibri" w:hAnsi="Calibri" w:cs="Calibri"/>
-          <w:sz w:val="22"/>
-          <w:szCs w:val="22"/>
-        </w:rPr>
-      </w:pPr>
     </w:p>
     <w:p>
       <w:pPr>
@@ -1904,9 +1843,8 @@
           <w:sz w:val="22"/>
           <w:szCs w:val="22"/>
         </w:rPr>
-        <w:t xml:space="preserve">2.1.2 </w:t>
-      </w:r>
-      <w:proofErr w:type="spellStart"/>
+        <w:t>2.1.2 Appearance-</w:t>
+      </w:r>
       <w:r>
         <w:rPr>
           <w:rFonts w:ascii="Calibri" w:hAnsi="Calibri" w:cs="Calibri"/>
@@ -1915,9 +1853,8 @@
           <w:sz w:val="22"/>
           <w:szCs w:val="22"/>
         </w:rPr>
-        <w:t>Appearance-Based</w:t>
-      </w:r>
-      <w:proofErr w:type="spellEnd"/>
+        <w:t>basierte</w:t>
+      </w:r>
       <w:r>
         <w:rPr>
           <w:rFonts w:ascii="Calibri" w:hAnsi="Calibri" w:cs="Calibri"/>
@@ -1927,100 +1864,6 @@
           <w:szCs w:val="22"/>
         </w:rPr>
         <w:t xml:space="preserve"> Verfahren</w:t>
-      </w:r>
-    </w:p>
-    <w:p>
-      <w:pPr>
-        <w:numPr>
-          <w:ilvl w:val="0"/>
-          <w:numId w:val="5"/>
-        </w:numPr>
-        <w:rPr>
-          <w:rFonts w:ascii="Calibri" w:hAnsi="Calibri" w:cs="Calibri"/>
-          <w:sz w:val="22"/>
-          <w:szCs w:val="22"/>
-        </w:rPr>
-      </w:pPr>
-      <w:r>
-        <w:rPr>
-          <w:rFonts w:ascii="Calibri" w:hAnsi="Calibri" w:cs="Calibri"/>
-          <w:sz w:val="22"/>
-          <w:szCs w:val="22"/>
-        </w:rPr>
-        <w:t>Bildbasierte Schätzung</w:t>
-      </w:r>
-    </w:p>
-    <w:p>
-      <w:pPr>
-        <w:numPr>
-          <w:ilvl w:val="0"/>
-          <w:numId w:val="5"/>
-        </w:numPr>
-        <w:rPr>
-          <w:rFonts w:ascii="Calibri" w:hAnsi="Calibri" w:cs="Calibri"/>
-          <w:sz w:val="22"/>
-          <w:szCs w:val="22"/>
-        </w:rPr>
-      </w:pPr>
-      <w:proofErr w:type="spellStart"/>
-      <w:r>
-        <w:rPr>
-          <w:rFonts w:ascii="Calibri" w:hAnsi="Calibri" w:cs="Calibri"/>
-          <w:sz w:val="22"/>
-          <w:szCs w:val="22"/>
-        </w:rPr>
-        <w:t>Machine</w:t>
-      </w:r>
-      <w:proofErr w:type="spellEnd"/>
-      <w:r>
-        <w:rPr>
-          <w:rFonts w:ascii="Calibri" w:hAnsi="Calibri" w:cs="Calibri"/>
-          <w:sz w:val="22"/>
-          <w:szCs w:val="22"/>
-        </w:rPr>
-        <w:t xml:space="preserve"> Learning</w:t>
-      </w:r>
-    </w:p>
-    <w:p>
-      <w:pPr>
-        <w:numPr>
-          <w:ilvl w:val="0"/>
-          <w:numId w:val="5"/>
-        </w:numPr>
-        <w:rPr>
-          <w:rFonts w:ascii="Calibri" w:hAnsi="Calibri" w:cs="Calibri"/>
-          <w:sz w:val="22"/>
-          <w:szCs w:val="22"/>
-        </w:rPr>
-      </w:pPr>
-      <w:r>
-        <w:rPr>
-          <w:rFonts w:ascii="Calibri" w:hAnsi="Calibri" w:cs="Calibri"/>
-          <w:sz w:val="22"/>
-          <w:szCs w:val="22"/>
-        </w:rPr>
-        <w:t>Deep Learning</w:t>
-      </w:r>
-    </w:p>
-    <w:p>
-      <w:pPr>
-        <w:numPr>
-          <w:ilvl w:val="0"/>
-          <w:numId w:val="5"/>
-        </w:numPr>
-        <w:rPr>
-          <w:rFonts w:ascii="Calibri" w:hAnsi="Calibri" w:cs="Calibri"/>
-          <w:sz w:val="22"/>
-          <w:szCs w:val="22"/>
-        </w:rPr>
-      </w:pPr>
-      <w:r>
-        <w:rPr>
-          <w:rFonts w:ascii="Calibri" w:hAnsi="Calibri" w:cs="Calibri"/>
-          <w:sz w:val="22"/>
-          <w:szCs w:val="22"/>
-        </w:rPr>
-        <w:t>CNNs</w:t>
       </w:r>
     </w:p>
     <w:p>
@@ -2077,41 +1920,37 @@
         </w:rPr>
         <w:t xml:space="preserve">Im Gegensatz zu modellbasierten Verfahren verwenden </w:t>
       </w:r>
-      <w:proofErr w:type="spellStart"/>
-      <w:r>
-        <w:rPr>
-          <w:rFonts w:ascii="Calibri" w:hAnsi="Calibri" w:cs="Calibri"/>
-          <w:sz w:val="22"/>
-          <w:szCs w:val="22"/>
-        </w:rPr>
-        <w:t>Appearance</w:t>
-      </w:r>
-      <w:proofErr w:type="spellEnd"/>
-      <w:r>
-        <w:rPr>
-          <w:rFonts w:ascii="Calibri" w:hAnsi="Calibri" w:cs="Calibri"/>
-          <w:sz w:val="22"/>
-          <w:szCs w:val="22"/>
-        </w:rPr>
-        <w:t>-</w:t>
-      </w:r>
-      <w:proofErr w:type="spellStart"/>
-      <w:r>
-        <w:rPr>
-          <w:rFonts w:ascii="Calibri" w:hAnsi="Calibri" w:cs="Calibri"/>
-          <w:sz w:val="22"/>
-          <w:szCs w:val="22"/>
-        </w:rPr>
-        <w:t>Based</w:t>
-      </w:r>
-      <w:proofErr w:type="spellEnd"/>
-      <w:r>
-        <w:rPr>
-          <w:rFonts w:ascii="Calibri" w:hAnsi="Calibri" w:cs="Calibri"/>
-          <w:sz w:val="22"/>
-          <w:szCs w:val="22"/>
-        </w:rPr>
-        <w:t>-Verfahren</w:t>
+      <w:r>
+        <w:rPr>
+          <w:rFonts w:ascii="Calibri" w:hAnsi="Calibri" w:cs="Calibri"/>
+          <w:sz w:val="22"/>
+          <w:szCs w:val="22"/>
+        </w:rPr>
+        <w:t>a</w:t>
+      </w:r>
+      <w:r>
+        <w:rPr>
+          <w:rFonts w:ascii="Calibri" w:hAnsi="Calibri" w:cs="Calibri"/>
+          <w:sz w:val="22"/>
+          <w:szCs w:val="22"/>
+        </w:rPr>
+        <w:t>ppearance-</w:t>
+      </w:r>
+      <w:r>
+        <w:rPr>
+          <w:rFonts w:ascii="Calibri" w:hAnsi="Calibri" w:cs="Calibri"/>
+          <w:sz w:val="22"/>
+          <w:szCs w:val="22"/>
+        </w:rPr>
+        <w:t xml:space="preserve">basierte </w:t>
+      </w:r>
+      <w:r>
+        <w:rPr>
+          <w:rFonts w:ascii="Calibri" w:hAnsi="Calibri" w:cs="Calibri"/>
+          <w:sz w:val="22"/>
+          <w:szCs w:val="22"/>
+        </w:rPr>
+        <w:t>Verfahren</w:t>
       </w:r>
       <w:r>
         <w:rPr>
@@ -2127,25 +1966,7 @@
           <w:sz w:val="22"/>
           <w:szCs w:val="22"/>
         </w:rPr>
-        <w:t>kein explizites geometrisches Augenmodell. Stattdessen wird die Blickrichtung direkt aus dem visuellen Erscheinungsbild (</w:t>
-      </w:r>
-      <w:proofErr w:type="spellStart"/>
-      <w:r>
-        <w:rPr>
-          <w:rFonts w:ascii="Calibri" w:hAnsi="Calibri" w:cs="Calibri"/>
-          <w:sz w:val="22"/>
-          <w:szCs w:val="22"/>
-        </w:rPr>
-        <w:t>Appearance</w:t>
-      </w:r>
-      <w:proofErr w:type="spellEnd"/>
-      <w:r>
-        <w:rPr>
-          <w:rFonts w:ascii="Calibri" w:hAnsi="Calibri" w:cs="Calibri"/>
-          <w:sz w:val="22"/>
-          <w:szCs w:val="22"/>
-        </w:rPr>
-        <w:t>) des Auges geschätzt.</w:t>
+        <w:t>kein explizites geometrisches Augenmodell. Stattdessen wird die Blickrichtung direkt aus dem visuellen Erscheinungsbild (Appearance) des Auges geschätzt.</w:t>
       </w:r>
       <w:r>
         <w:rPr>
@@ -2177,25 +1998,7 @@
           <w:sz w:val="22"/>
           <w:szCs w:val="22"/>
         </w:rPr>
-        <w:t xml:space="preserve"> (Template </w:t>
-      </w:r>
-      <w:proofErr w:type="spellStart"/>
-      <w:r>
-        <w:rPr>
-          <w:rFonts w:ascii="Calibri" w:hAnsi="Calibri" w:cs="Calibri"/>
-          <w:sz w:val="22"/>
-          <w:szCs w:val="22"/>
-        </w:rPr>
-        <w:t>Matching</w:t>
-      </w:r>
-      <w:proofErr w:type="spellEnd"/>
-      <w:r>
-        <w:rPr>
-          <w:rFonts w:ascii="Calibri" w:hAnsi="Calibri" w:cs="Calibri"/>
-          <w:sz w:val="22"/>
-          <w:szCs w:val="22"/>
-        </w:rPr>
-        <w:t>)</w:t>
+        <w:t xml:space="preserve"> (Template Matching)</w:t>
       </w:r>
       <w:r>
         <w:rPr>
@@ -2211,60 +2014,72 @@
           <w:sz w:val="22"/>
           <w:szCs w:val="22"/>
         </w:rPr>
-        <w:t>Hierbei wird ein aufgenommenes Augenbild mit einer Datenbank von Referenzbildern verglichen, die bekannte Blickrichtungen zugeordnet sind. Die Blickrichtung des ähnlichsten Referenzbild wird anschließend als Schätzung für das aktuelle Augenbild verwendet. Spätere Verfahren verwenden anstelle vollständiger Augenbilder spezifische Bildmerkmale, um die Blickrichtung vorherzusagen.</w:t>
-      </w:r>
-    </w:p>
-    <w:p>
-      <w:pPr>
-        <w:rPr>
-          <w:rFonts w:ascii="Calibri" w:hAnsi="Calibri" w:cs="Calibri"/>
-          <w:sz w:val="22"/>
-          <w:szCs w:val="22"/>
-        </w:rPr>
-      </w:pPr>
-      <w:r>
-        <w:rPr>
-          <w:rFonts w:ascii="Calibri" w:hAnsi="Calibri" w:cs="Calibri"/>
-          <w:sz w:val="22"/>
-          <w:szCs w:val="22"/>
-        </w:rPr>
-        <w:t xml:space="preserve">Heute sind </w:t>
-      </w:r>
-      <w:proofErr w:type="spellStart"/>
-      <w:r>
-        <w:rPr>
-          <w:rFonts w:ascii="Calibri" w:hAnsi="Calibri" w:cs="Calibri"/>
-          <w:sz w:val="22"/>
-          <w:szCs w:val="22"/>
-        </w:rPr>
-        <w:t>Appearance</w:t>
-      </w:r>
-      <w:proofErr w:type="spellEnd"/>
-      <w:r>
-        <w:rPr>
-          <w:rFonts w:ascii="Calibri" w:hAnsi="Calibri" w:cs="Calibri"/>
-          <w:sz w:val="22"/>
-          <w:szCs w:val="22"/>
-        </w:rPr>
-        <w:t>-</w:t>
-      </w:r>
-      <w:proofErr w:type="spellStart"/>
-      <w:r>
-        <w:rPr>
-          <w:rFonts w:ascii="Calibri" w:hAnsi="Calibri" w:cs="Calibri"/>
-          <w:sz w:val="22"/>
-          <w:szCs w:val="22"/>
-        </w:rPr>
-        <w:t>Based</w:t>
-      </w:r>
-      <w:proofErr w:type="spellEnd"/>
-      <w:r>
-        <w:rPr>
-          <w:rFonts w:ascii="Calibri" w:hAnsi="Calibri" w:cs="Calibri"/>
-          <w:sz w:val="22"/>
-          <w:szCs w:val="22"/>
-        </w:rPr>
-        <w:t>-Verfahren überwiegend durch Deep Learning realisiert. Statt festen Regeln und Vorlagen, lernen die Modelle den Zusammenhang zwischen Augenbild und Blickrichtung direkt aus den Trainingsdaten</w:t>
+        <w:t>Hierbei wird ein aufgenommenes Augenbild mit einer Datenbank von Referenzbildern verglichen, die bekannte</w:t>
+      </w:r>
+      <w:r>
+        <w:rPr>
+          <w:rFonts w:ascii="Calibri" w:hAnsi="Calibri" w:cs="Calibri"/>
+          <w:sz w:val="22"/>
+          <w:szCs w:val="22"/>
+        </w:rPr>
+        <w:t>n</w:t>
+      </w:r>
+      <w:r>
+        <w:rPr>
+          <w:rFonts w:ascii="Calibri" w:hAnsi="Calibri" w:cs="Calibri"/>
+          <w:sz w:val="22"/>
+          <w:szCs w:val="22"/>
+        </w:rPr>
+        <w:t xml:space="preserve"> Blickrichtungen zugeordnet sind. Die Blickrichtung des ähnlichsten Referenzbild wird anschließend als Schätzung für das aktuelle Augenbild verwendet. Spätere Verfahren verwenden anstelle vollständiger Augenbilder spezifische Bildmerkmale, um die Blickrichtung vorherzusagen.</w:t>
+      </w:r>
+    </w:p>
+    <w:p>
+      <w:pPr>
+        <w:rPr>
+          <w:rFonts w:ascii="Calibri" w:hAnsi="Calibri" w:cs="Calibri"/>
+          <w:sz w:val="22"/>
+          <w:szCs w:val="22"/>
+        </w:rPr>
+      </w:pPr>
+      <w:r>
+        <w:rPr>
+          <w:rFonts w:ascii="Calibri" w:hAnsi="Calibri" w:cs="Calibri"/>
+          <w:sz w:val="22"/>
+          <w:szCs w:val="22"/>
+        </w:rPr>
+        <w:t>Heute sind Appearance-</w:t>
+      </w:r>
+      <w:r>
+        <w:rPr>
+          <w:rFonts w:ascii="Calibri" w:hAnsi="Calibri" w:cs="Calibri"/>
+          <w:sz w:val="22"/>
+          <w:szCs w:val="22"/>
+        </w:rPr>
+        <w:t xml:space="preserve">basierte </w:t>
+      </w:r>
+      <w:r>
+        <w:rPr>
+          <w:rFonts w:ascii="Calibri" w:hAnsi="Calibri" w:cs="Calibri"/>
+          <w:sz w:val="22"/>
+          <w:szCs w:val="22"/>
+        </w:rPr>
+        <w:t xml:space="preserve">Verfahren überwiegend durch Deep Learning realisiert. </w:t>
+      </w:r>
+      <w:r>
+        <w:rPr>
+          <w:rFonts w:ascii="Calibri" w:hAnsi="Calibri" w:cs="Calibri"/>
+          <w:sz w:val="22"/>
+          <w:szCs w:val="22"/>
+        </w:rPr>
+        <w:t>Anstelle von Regeln und Vorlagen</w:t>
+      </w:r>
+      <w:r>
+        <w:rPr>
+          <w:rFonts w:ascii="Calibri" w:hAnsi="Calibri" w:cs="Calibri"/>
+          <w:sz w:val="22"/>
+          <w:szCs w:val="22"/>
+        </w:rPr>
+        <w:t>, lernen die Modelle den Zusammenhang zwischen Augenbild und Blickrichtung direkt aus den Trainingsdaten</w:t>
       </w:r>
       <w:r>
         <w:rPr>
@@ -2280,25 +2095,7 @@
           <w:sz w:val="22"/>
           <w:szCs w:val="22"/>
         </w:rPr>
-        <w:t xml:space="preserve">Durch die Deep Feature </w:t>
-      </w:r>
-      <w:proofErr w:type="spellStart"/>
-      <w:r>
-        <w:rPr>
-          <w:rFonts w:ascii="Calibri" w:hAnsi="Calibri" w:cs="Calibri"/>
-          <w:sz w:val="22"/>
-          <w:szCs w:val="22"/>
-        </w:rPr>
-        <w:t>Extraction</w:t>
-      </w:r>
-      <w:proofErr w:type="spellEnd"/>
-      <w:r>
-        <w:rPr>
-          <w:rFonts w:ascii="Calibri" w:hAnsi="Calibri" w:cs="Calibri"/>
-          <w:sz w:val="22"/>
-          <w:szCs w:val="22"/>
-        </w:rPr>
-        <w:t xml:space="preserve"> lernen Deep-Learning-Modelle selbstständig</w:t>
+        <w:t>Durch die Deep Feature Extraction lernen Deep-Learning-Modelle selbstständig</w:t>
       </w:r>
       <w:r>
         <w:rPr>
@@ -2323,79 +2120,67 @@
           <w:sz w:val="22"/>
           <w:szCs w:val="22"/>
         </w:rPr>
+        <w:t>Die Grundlage vieler moderner Verfahren bilden Convolutional Neural Networks (CNNs). Diese Netzwerke sind speziell für die Verarbeitung von Bilddaten konzipiert und extrahieren Merkmale</w:t>
+      </w:r>
+      <w:r>
+        <w:rPr>
+          <w:rFonts w:ascii="Calibri" w:hAnsi="Calibri" w:cs="Calibri"/>
+          <w:sz w:val="22"/>
+          <w:szCs w:val="22"/>
+        </w:rPr>
+        <w:t xml:space="preserve"> schichtweise.</w:t>
+      </w:r>
+      <w:r>
+        <w:rPr>
+          <w:rFonts w:ascii="Calibri" w:hAnsi="Calibri" w:cs="Calibri"/>
+          <w:sz w:val="22"/>
+          <w:szCs w:val="22"/>
+        </w:rPr>
+        <w:t xml:space="preserve"> Frühe Netzwerkschichten erkennen einfache Strukturen wie Kanten oder Kontraste, </w:t>
+      </w:r>
+      <w:r>
+        <w:rPr>
+          <w:rFonts w:ascii="Calibri" w:hAnsi="Calibri" w:cs="Calibri"/>
+          <w:sz w:val="22"/>
+          <w:szCs w:val="22"/>
+        </w:rPr>
         <w:lastRenderedPageBreak/>
-        <w:t xml:space="preserve">Die Grundlage vieler moderner Verfahren bilden </w:t>
-      </w:r>
-      <w:proofErr w:type="spellStart"/>
-      <w:r>
-        <w:rPr>
-          <w:rFonts w:ascii="Calibri" w:hAnsi="Calibri" w:cs="Calibri"/>
-          <w:sz w:val="22"/>
-          <w:szCs w:val="22"/>
-        </w:rPr>
-        <w:t>Convolutional</w:t>
-      </w:r>
-      <w:proofErr w:type="spellEnd"/>
-      <w:r>
-        <w:rPr>
-          <w:rFonts w:ascii="Calibri" w:hAnsi="Calibri" w:cs="Calibri"/>
-          <w:sz w:val="22"/>
-          <w:szCs w:val="22"/>
-        </w:rPr>
-        <w:t xml:space="preserve"> </w:t>
-      </w:r>
-      <w:proofErr w:type="spellStart"/>
-      <w:r>
-        <w:rPr>
-          <w:rFonts w:ascii="Calibri" w:hAnsi="Calibri" w:cs="Calibri"/>
-          <w:sz w:val="22"/>
-          <w:szCs w:val="22"/>
-        </w:rPr>
-        <w:t>Neural</w:t>
-      </w:r>
-      <w:proofErr w:type="spellEnd"/>
-      <w:r>
-        <w:rPr>
-          <w:rFonts w:ascii="Calibri" w:hAnsi="Calibri" w:cs="Calibri"/>
-          <w:sz w:val="22"/>
-          <w:szCs w:val="22"/>
-        </w:rPr>
-        <w:t xml:space="preserve"> Networks (CNNs). Diese Netzwerke sind speziell für die Verarbeitung von Bilddaten konzipiert und extrahieren Merkmale</w:t>
-      </w:r>
-      <w:r>
-        <w:rPr>
-          <w:rFonts w:ascii="Calibri" w:hAnsi="Calibri" w:cs="Calibri"/>
-          <w:sz w:val="22"/>
-          <w:szCs w:val="22"/>
-        </w:rPr>
-        <w:t xml:space="preserve"> schichtweise.</w:t>
-      </w:r>
-      <w:r>
-        <w:rPr>
-          <w:rFonts w:ascii="Calibri" w:hAnsi="Calibri" w:cs="Calibri"/>
-          <w:sz w:val="22"/>
-          <w:szCs w:val="22"/>
-        </w:rPr>
-        <w:t xml:space="preserve"> Frühe Netzwerkschichten erkennen einfache Strukturen wie Kanten oder Kontraste, während tiefere Netzwerkschichten komplexere Informationen erfassen können. Die gewonnenen Merkmale werden anschließend dann zur Vorhersage der Blickrichtung verwendet.</w:t>
-      </w:r>
-    </w:p>
-    <w:p>
-      <w:pPr>
-        <w:rPr>
-          <w:rFonts w:ascii="Calibri" w:hAnsi="Calibri" w:cs="Calibri"/>
-          <w:sz w:val="22"/>
-          <w:szCs w:val="22"/>
-        </w:rPr>
-      </w:pPr>
-      <w:r>
-        <w:rPr>
-          <w:rFonts w:ascii="Calibri" w:hAnsi="Calibri" w:cs="Calibri"/>
-          <w:sz w:val="22"/>
-          <w:szCs w:val="22"/>
-          <w:highlight w:val="yellow"/>
-        </w:rPr>
-        <w:t>Datensätze</w:t>
-      </w:r>
+        <w:t>während tiefere Netzwerkschichten komplexere Informationen erfassen können. Die gewonnenen Merkmale werden anschließend dann zur Vorhersage der Blickrichtung verwendet.</w:t>
+      </w:r>
+    </w:p>
+    <w:p>
+      <w:pPr>
+        <w:rPr>
+          <w:rFonts w:ascii="Calibri" w:hAnsi="Calibri" w:cs="Calibri"/>
+          <w:sz w:val="22"/>
+          <w:szCs w:val="22"/>
+        </w:rPr>
+      </w:pPr>
+      <w:r>
+        <w:rPr>
+          <w:rFonts w:ascii="Calibri" w:hAnsi="Calibri" w:cs="Calibri"/>
+          <w:sz w:val="22"/>
+          <w:szCs w:val="22"/>
+        </w:rPr>
+        <w:t>Die modellbasierten Verfahren</w:t>
+      </w:r>
+      <w:r>
+        <w:rPr>
+          <w:rFonts w:ascii="Calibri" w:hAnsi="Calibri" w:cs="Calibri"/>
+          <w:sz w:val="22"/>
+          <w:szCs w:val="22"/>
+        </w:rPr>
+        <w:t xml:space="preserve"> sind im letzten Jahrzent in den Hintergrund geraten</w:t>
+      </w:r>
+    </w:p>
+    <w:p>
+      <w:pPr>
+        <w:rPr>
+          <w:rFonts w:ascii="Calibri" w:hAnsi="Calibri" w:cs="Calibri"/>
+          <w:sz w:val="22"/>
+          <w:szCs w:val="22"/>
+        </w:rPr>
+      </w:pPr>
     </w:p>
     <w:p>
       <w:pPr>
@@ -2435,65 +2220,6 @@
           <w:szCs w:val="22"/>
         </w:rPr>
         <w:t>2.1.3 Hybride Verfahren</w:t>
-      </w:r>
-    </w:p>
-    <w:p>
-      <w:pPr>
-        <w:rPr>
-          <w:rFonts w:ascii="Calibri" w:hAnsi="Calibri" w:cs="Calibri"/>
-          <w:sz w:val="22"/>
-          <w:szCs w:val="22"/>
-        </w:rPr>
-      </w:pPr>
-      <w:r>
-        <w:rPr>
-          <w:rFonts w:ascii="Calibri" w:hAnsi="Calibri" w:cs="Calibri"/>
-          <w:sz w:val="22"/>
-          <w:szCs w:val="22"/>
-        </w:rPr>
-        <w:t>Hier reichen 1–2 Absätze:</w:t>
-      </w:r>
-    </w:p>
-    <w:p>
-      <w:pPr>
-        <w:numPr>
-          <w:ilvl w:val="0"/>
-          <w:numId w:val="7"/>
-        </w:numPr>
-        <w:rPr>
-          <w:rFonts w:ascii="Calibri" w:hAnsi="Calibri" w:cs="Calibri"/>
-          <w:sz w:val="22"/>
-          <w:szCs w:val="22"/>
-        </w:rPr>
-      </w:pPr>
-      <w:r>
-        <w:rPr>
-          <w:rFonts w:ascii="Calibri" w:hAnsi="Calibri" w:cs="Calibri"/>
-          <w:sz w:val="22"/>
-          <w:szCs w:val="22"/>
-        </w:rPr>
-        <w:t>Kombination aus Geometrie und Deep Learning</w:t>
-      </w:r>
-    </w:p>
-    <w:p>
-      <w:pPr>
-        <w:numPr>
-          <w:ilvl w:val="0"/>
-          <w:numId w:val="7"/>
-        </w:numPr>
-        <w:rPr>
-          <w:rFonts w:ascii="Calibri" w:hAnsi="Calibri" w:cs="Calibri"/>
-          <w:sz w:val="22"/>
-          <w:szCs w:val="22"/>
-        </w:rPr>
-      </w:pPr>
-      <w:r>
-        <w:rPr>
-          <w:rFonts w:ascii="Calibri" w:hAnsi="Calibri" w:cs="Calibri"/>
-          <w:sz w:val="22"/>
-          <w:szCs w:val="22"/>
-        </w:rPr>
-        <w:t>Motivation</w:t>
       </w:r>
     </w:p>
     <w:p>
@@ -2571,6 +2297,96 @@
           <w:sz w:val="22"/>
           <w:szCs w:val="22"/>
         </w:rPr>
+        <w:t xml:space="preserve">Cheng </w:t>
+      </w:r>
+      <w:r>
+        <w:rPr>
+          <w:rFonts w:ascii="Calibri" w:hAnsi="Calibri" w:cs="Calibri"/>
+          <w:sz w:val="22"/>
+          <w:szCs w:val="22"/>
+        </w:rPr>
+        <w:t>et al. Weisen darauf hin, das neben rein modellbasierten und rein appearance-basierten Verfahren zunehmend hybride Ansätze erforscht</w:t>
+      </w:r>
+      <w:r>
+        <w:rPr>
+          <w:rFonts w:ascii="Calibri" w:hAnsi="Calibri" w:cs="Calibri"/>
+          <w:sz w:val="22"/>
+          <w:szCs w:val="22"/>
+        </w:rPr>
+        <w:t xml:space="preserve"> werden</w:t>
+      </w:r>
+      <w:r>
+        <w:rPr>
+          <w:rFonts w:ascii="Calibri" w:hAnsi="Calibri" w:cs="Calibri"/>
+          <w:sz w:val="22"/>
+          <w:szCs w:val="22"/>
+        </w:rPr>
+        <w:t>. Diese Verfahren kombinieren die automatische Extraktion von Merkmalen durch Deep-Learning Modellen mit zusätzlichen geometrischen Informationen, wie beispielsweise der Augengeometrie, um die Genauigkeit und Robustheit der Blickschätzung zu verbessern.</w:t>
+      </w:r>
+    </w:p>
+    <w:p>
+      <w:pPr>
+        <w:rPr>
+          <w:rFonts w:ascii="Calibri" w:hAnsi="Calibri" w:cs="Calibri"/>
+          <w:sz w:val="22"/>
+          <w:szCs w:val="22"/>
+        </w:rPr>
+      </w:pPr>
+      <w:r>
+        <w:rPr>
+          <w:rFonts w:ascii="Calibri" w:hAnsi="Calibri" w:cs="Calibri"/>
+          <w:sz w:val="22"/>
+          <w:szCs w:val="22"/>
+        </w:rPr>
+        <w:t>Ein Beispiel für einen</w:t>
+      </w:r>
+      <w:r>
+        <w:rPr>
+          <w:rFonts w:ascii="Calibri" w:hAnsi="Calibri" w:cs="Calibri"/>
+          <w:sz w:val="22"/>
+          <w:szCs w:val="22"/>
+        </w:rPr>
+        <w:t xml:space="preserve"> solchen</w:t>
+      </w:r>
+      <w:r>
+        <w:rPr>
+          <w:rFonts w:ascii="Calibri" w:hAnsi="Calibri" w:cs="Calibri"/>
+          <w:sz w:val="22"/>
+          <w:szCs w:val="22"/>
+        </w:rPr>
+        <w:t xml:space="preserve"> hybriden Ansatz wurde von Kaur vorgestellt. Es wird eine zusätzliche Schicht, ein Geometric Layer </w:t>
+      </w:r>
+      <w:r>
+        <w:rPr>
+          <w:rFonts w:ascii="Calibri" w:hAnsi="Calibri" w:cs="Calibri"/>
+          <w:sz w:val="22"/>
+          <w:szCs w:val="22"/>
+        </w:rPr>
+        <w:t xml:space="preserve">direkt in das neuronale Netzwerk </w:t>
+      </w:r>
+      <w:r>
+        <w:rPr>
+          <w:rFonts w:ascii="Calibri" w:hAnsi="Calibri" w:cs="Calibri"/>
+          <w:sz w:val="22"/>
+          <w:szCs w:val="22"/>
+        </w:rPr>
+        <w:t>integriert. Die Schicht bindet geometrische Eigenschaften des menschlichen Auges in den Lernprozess ein, sodass das Modell bei der Blickschätzung nicht ausschließlich auf Bildmerkmale angewiesen ist. Ziel ist es, die Interpretierbarkeit der Vorhersagen zu erhöhen und die Generalisierbarkeit auf unbekannte Datensätze zu verbessern.</w:t>
+      </w:r>
+    </w:p>
+    <w:p>
+      <w:pPr>
+        <w:rPr>
+          <w:rFonts w:ascii="Calibri" w:hAnsi="Calibri" w:cs="Calibri"/>
+          <w:sz w:val="22"/>
+          <w:szCs w:val="22"/>
+        </w:rPr>
+      </w:pPr>
+      <w:r>
+        <w:rPr>
+          <w:rFonts w:ascii="Calibri" w:hAnsi="Calibri" w:cs="Calibri"/>
+          <w:sz w:val="22"/>
+          <w:szCs w:val="22"/>
+        </w:rPr>
         <w:pict w14:anchorId="5DBDDEBE">
           <v:rect id="_x0000_i1028" style="width:0;height:1.5pt" o:hralign="center" o:hrstd="t" o:hr="t" fillcolor="#a0a0a0" stroked="f"/>
         </w:pict>
@@ -2580,137 +2396,461 @@
       <w:pPr>
         <w:rPr>
           <w:rFonts w:ascii="Calibri" w:hAnsi="Calibri" w:cs="Calibri"/>
-          <w:b/>
-          <w:bCs/>
-          <w:sz w:val="22"/>
-          <w:szCs w:val="22"/>
-        </w:rPr>
-      </w:pPr>
-      <w:r>
-        <w:rPr>
-          <w:rFonts w:ascii="Calibri" w:hAnsi="Calibri" w:cs="Calibri"/>
-          <w:b/>
-          <w:bCs/>
-          <w:sz w:val="22"/>
-          <w:szCs w:val="22"/>
-        </w:rPr>
-        <w:t>2.1.4 Bewertung von Gaze-</w:t>
-      </w:r>
-      <w:proofErr w:type="spellStart"/>
-      <w:r>
-        <w:rPr>
-          <w:rFonts w:ascii="Calibri" w:hAnsi="Calibri" w:cs="Calibri"/>
-          <w:b/>
-          <w:bCs/>
-          <w:sz w:val="22"/>
-          <w:szCs w:val="22"/>
-        </w:rPr>
-        <w:t>Estimation</w:t>
-      </w:r>
-      <w:proofErr w:type="spellEnd"/>
-      <w:r>
-        <w:rPr>
-          <w:rFonts w:ascii="Calibri" w:hAnsi="Calibri" w:cs="Calibri"/>
-          <w:b/>
-          <w:bCs/>
-          <w:sz w:val="22"/>
-          <w:szCs w:val="22"/>
-        </w:rPr>
-        <w:t>-Verfahren</w:t>
-      </w:r>
-    </w:p>
-    <w:p>
-      <w:pPr>
-        <w:numPr>
-          <w:ilvl w:val="0"/>
-          <w:numId w:val="9"/>
-        </w:numPr>
-        <w:rPr>
-          <w:rFonts w:ascii="Calibri" w:hAnsi="Calibri" w:cs="Calibri"/>
-          <w:sz w:val="22"/>
-          <w:szCs w:val="22"/>
-        </w:rPr>
-      </w:pPr>
-      <w:r>
-        <w:rPr>
-          <w:rFonts w:ascii="Calibri" w:hAnsi="Calibri" w:cs="Calibri"/>
-          <w:sz w:val="22"/>
-          <w:szCs w:val="22"/>
-        </w:rPr>
-        <w:t>Angular Error</w:t>
-      </w:r>
-    </w:p>
-    <w:p>
-      <w:pPr>
-        <w:numPr>
-          <w:ilvl w:val="0"/>
-          <w:numId w:val="9"/>
-        </w:numPr>
-        <w:rPr>
-          <w:rFonts w:ascii="Calibri" w:hAnsi="Calibri" w:cs="Calibri"/>
-          <w:sz w:val="22"/>
-          <w:szCs w:val="22"/>
-        </w:rPr>
-      </w:pPr>
-      <w:r>
-        <w:rPr>
-          <w:rFonts w:ascii="Calibri" w:hAnsi="Calibri" w:cs="Calibri"/>
-          <w:sz w:val="22"/>
-          <w:szCs w:val="22"/>
-        </w:rPr>
-        <w:t>2D-Fehler</w:t>
-      </w:r>
-    </w:p>
-    <w:p>
-      <w:pPr>
-        <w:numPr>
-          <w:ilvl w:val="0"/>
-          <w:numId w:val="9"/>
-        </w:numPr>
-        <w:rPr>
-          <w:rFonts w:ascii="Calibri" w:hAnsi="Calibri" w:cs="Calibri"/>
-          <w:sz w:val="22"/>
-          <w:szCs w:val="22"/>
-        </w:rPr>
-      </w:pPr>
-      <w:r>
-        <w:rPr>
-          <w:rFonts w:ascii="Calibri" w:hAnsi="Calibri" w:cs="Calibri"/>
-          <w:sz w:val="22"/>
-          <w:szCs w:val="22"/>
-        </w:rPr>
-        <w:t>Generalisierung</w:t>
-      </w:r>
-    </w:p>
-    <w:p>
-      <w:pPr>
-        <w:rPr>
-          <w:rFonts w:ascii="Calibri" w:hAnsi="Calibri" w:cs="Calibri"/>
-          <w:sz w:val="22"/>
-          <w:szCs w:val="22"/>
-        </w:rPr>
-      </w:pPr>
-      <w:r>
-        <w:rPr>
-          <w:rFonts w:ascii="Calibri" w:hAnsi="Calibri" w:cs="Calibri"/>
-          <w:sz w:val="22"/>
-          <w:szCs w:val="22"/>
-        </w:rPr>
-        <w:t>Quelle:</w:t>
-      </w:r>
-    </w:p>
-    <w:p>
-      <w:pPr>
-        <w:numPr>
-          <w:ilvl w:val="0"/>
-          <w:numId w:val="10"/>
-        </w:numPr>
-        <w:rPr>
-          <w:rFonts w:ascii="Calibri" w:hAnsi="Calibri" w:cs="Calibri"/>
-          <w:sz w:val="22"/>
-          <w:szCs w:val="22"/>
-        </w:rPr>
-      </w:pPr>
+          <w:sz w:val="22"/>
+          <w:szCs w:val="22"/>
+        </w:rPr>
+      </w:pPr>
+      <w:r>
+        <w:rPr>
+          <w:rFonts w:ascii="Calibri" w:hAnsi="Calibri" w:cs="Calibri"/>
+          <w:sz w:val="22"/>
+          <w:szCs w:val="22"/>
+        </w:rPr>
+        <w:t>2.2 Koordinatensysteme</w:t>
+      </w:r>
+    </w:p>
+    <w:p>
+      <w:pPr>
+        <w:tabs>
+          <w:tab w:val="left" w:pos="3068"/>
+        </w:tabs>
+        <w:rPr>
+          <w:rFonts w:ascii="Calibri" w:hAnsi="Calibri" w:cs="Calibri"/>
+          <w:sz w:val="22"/>
+          <w:szCs w:val="22"/>
+        </w:rPr>
+      </w:pPr>
+      <w:r>
+        <w:rPr>
+          <w:rFonts w:ascii="Calibri" w:hAnsi="Calibri" w:cs="Calibri"/>
+          <w:sz w:val="22"/>
+          <w:szCs w:val="22"/>
+        </w:rPr>
+        <w:t xml:space="preserve">Quellen: </w:t>
+      </w:r>
+      <w:r>
+        <w:rPr>
+          <w:rFonts w:ascii="Calibri" w:hAnsi="Calibri" w:cs="Calibri"/>
+          <w:sz w:val="22"/>
+          <w:szCs w:val="22"/>
+        </w:rPr>
+        <w:t>Hansen &amp; Ji (2010)</w:t>
+      </w:r>
+      <w:r>
+        <w:rPr>
+          <w:rFonts w:ascii="Calibri" w:hAnsi="Calibri" w:cs="Calibri"/>
+          <w:sz w:val="22"/>
+          <w:szCs w:val="22"/>
+        </w:rPr>
+        <w:t xml:space="preserve">, </w:t>
+      </w:r>
+      <w:r>
+        <w:rPr>
+          <w:rFonts w:ascii="Calibri" w:hAnsi="Calibri" w:cs="Calibri"/>
+          <w:sz w:val="22"/>
+          <w:szCs w:val="22"/>
+        </w:rPr>
+        <w:t>Kaur et al. (2022)</w:t>
+      </w:r>
+    </w:p>
+    <w:p>
+      <w:pPr>
+        <w:rPr>
+          <w:rFonts w:ascii="Calibri" w:hAnsi="Calibri" w:cs="Calibri"/>
+          <w:sz w:val="22"/>
+          <w:szCs w:val="22"/>
+        </w:rPr>
+      </w:pPr>
+      <w:r>
+        <w:rPr>
+          <w:rFonts w:ascii="Calibri" w:hAnsi="Calibri" w:cs="Calibri"/>
+          <w:sz w:val="22"/>
+          <w:szCs w:val="22"/>
+        </w:rPr>
+        <w:t>Bezugssysteme</w:t>
+      </w:r>
+    </w:p>
+    <w:p>
+      <w:pPr>
+        <w:rPr>
+          <w:rFonts w:ascii="Calibri" w:hAnsi="Calibri" w:cs="Calibri"/>
+          <w:sz w:val="22"/>
+          <w:szCs w:val="22"/>
+        </w:rPr>
+      </w:pPr>
+      <w:r>
+        <w:rPr>
+          <w:rFonts w:ascii="Calibri" w:hAnsi="Calibri" w:cs="Calibri"/>
+          <w:sz w:val="22"/>
+          <w:szCs w:val="22"/>
+        </w:rPr>
+        <w:t>Bildkoordinatensystem</w:t>
+      </w:r>
+    </w:p>
+    <w:p>
+      <w:pPr>
+        <w:rPr>
+          <w:rFonts w:ascii="Calibri" w:hAnsi="Calibri" w:cs="Calibri"/>
+          <w:sz w:val="22"/>
+          <w:szCs w:val="22"/>
+        </w:rPr>
+      </w:pPr>
+      <w:r>
+        <w:rPr>
+          <w:rFonts w:ascii="Calibri" w:hAnsi="Calibri" w:cs="Calibri"/>
+          <w:sz w:val="22"/>
+          <w:szCs w:val="22"/>
+        </w:rPr>
+        <w:t>Kopfkoordinatensystem</w:t>
+      </w:r>
+    </w:p>
+    <w:p>
+      <w:pPr>
+        <w:rPr>
+          <w:rFonts w:ascii="Calibri" w:hAnsi="Calibri" w:cs="Calibri"/>
+          <w:sz w:val="22"/>
+          <w:szCs w:val="22"/>
+        </w:rPr>
+      </w:pPr>
+      <w:r>
+        <w:rPr>
+          <w:rFonts w:ascii="Calibri" w:hAnsi="Calibri" w:cs="Calibri"/>
+          <w:sz w:val="22"/>
+          <w:szCs w:val="22"/>
+        </w:rPr>
+        <w:t>Augenkoordinatensystem</w:t>
+      </w:r>
+    </w:p>
+    <w:p>
+      <w:pPr>
+        <w:rPr>
+          <w:rFonts w:ascii="Calibri" w:hAnsi="Calibri" w:cs="Calibri"/>
+          <w:sz w:val="22"/>
+          <w:szCs w:val="22"/>
+        </w:rPr>
+      </w:pPr>
+      <w:r>
+        <w:rPr>
+          <w:rFonts w:ascii="Calibri" w:hAnsi="Calibri" w:cs="Calibri"/>
+          <w:sz w:val="22"/>
+          <w:szCs w:val="22"/>
+        </w:rPr>
+        <w:t>Weltkoordinatensystem</w:t>
+      </w:r>
+    </w:p>
+    <w:p>
+      <w:pPr>
+        <w:rPr>
+          <w:rFonts w:ascii="Calibri" w:hAnsi="Calibri" w:cs="Calibri"/>
+          <w:sz w:val="22"/>
+          <w:szCs w:val="22"/>
+        </w:rPr>
+      </w:pPr>
+      <w:r>
+        <w:rPr>
+          <w:rFonts w:ascii="Calibri" w:hAnsi="Calibri" w:cs="Calibri"/>
+          <w:sz w:val="22"/>
+          <w:szCs w:val="22"/>
+        </w:rPr>
+        <w:t>Blickrichtung ist 3d Vektor, daher müssen Transformationen zwischen den Koordinatensystemen durchgeführt werden.</w:t>
+      </w:r>
+    </w:p>
+    <w:p>
+      <w:pPr>
+        <w:rPr>
+          <w:rFonts w:ascii="Calibri" w:hAnsi="Calibri" w:cs="Calibri"/>
+          <w:sz w:val="22"/>
+          <w:szCs w:val="22"/>
+        </w:rPr>
+      </w:pPr>
+      <w:r>
+        <w:rPr>
+          <w:rFonts w:ascii="Calibri" w:hAnsi="Calibri" w:cs="Calibri"/>
+          <w:sz w:val="22"/>
+          <w:szCs w:val="22"/>
+        </w:rPr>
+        <w:t>2.3 Kamerakalibrierung und Synchronisation</w:t>
+      </w:r>
+    </w:p>
+    <w:p>
+      <w:pPr>
+        <w:rPr>
+          <w:rFonts w:ascii="Calibri" w:hAnsi="Calibri" w:cs="Calibri"/>
+          <w:sz w:val="22"/>
+          <w:szCs w:val="22"/>
+        </w:rPr>
+      </w:pPr>
+      <w:r>
+        <w:rPr>
+          <w:rFonts w:ascii="Calibri" w:hAnsi="Calibri" w:cs="Calibri"/>
+          <w:sz w:val="22"/>
+          <w:szCs w:val="22"/>
+        </w:rPr>
+        <w:t xml:space="preserve">Quellen: </w:t>
+      </w:r>
+      <w:r>
+        <w:rPr>
+          <w:rFonts w:ascii="Calibri" w:hAnsi="Calibri" w:cs="Calibri"/>
+          <w:sz w:val="22"/>
+          <w:szCs w:val="22"/>
+        </w:rPr>
+        <w:t>Zhang (2000)</w:t>
+      </w:r>
+      <w:r>
+        <w:rPr>
+          <w:rFonts w:ascii="Calibri" w:hAnsi="Calibri" w:cs="Calibri"/>
+          <w:sz w:val="22"/>
+          <w:szCs w:val="22"/>
+        </w:rPr>
+        <w:t xml:space="preserve">, Beispiele: </w:t>
+      </w:r>
+      <w:r>
+        <w:rPr>
+          <w:rFonts w:ascii="Calibri" w:hAnsi="Calibri" w:cs="Calibri"/>
+          <w:sz w:val="22"/>
+          <w:szCs w:val="22"/>
+        </w:rPr>
+        <w:t>Olson (2011) AprilTag</w:t>
+      </w:r>
+      <w:r>
+        <w:rPr>
+          <w:rFonts w:ascii="Calibri" w:hAnsi="Calibri" w:cs="Calibri"/>
+          <w:sz w:val="22"/>
+          <w:szCs w:val="22"/>
+        </w:rPr>
+        <w:t xml:space="preserve">, </w:t>
+      </w:r>
+      <w:r>
+        <w:rPr>
+          <w:rFonts w:ascii="Calibri" w:hAnsi="Calibri" w:cs="Calibri"/>
+          <w:sz w:val="22"/>
+          <w:szCs w:val="22"/>
+        </w:rPr>
+        <w:t>EYEDIAP (Funes Mora et al., 2014)</w:t>
+      </w:r>
+    </w:p>
+    <w:p>
+      <w:pPr>
+        <w:rPr>
+          <w:rFonts w:ascii="Calibri" w:hAnsi="Calibri" w:cs="Calibri"/>
+          <w:sz w:val="22"/>
+          <w:szCs w:val="22"/>
+        </w:rPr>
+      </w:pPr>
+      <w:r>
+        <w:rPr>
+          <w:rFonts w:ascii="Calibri" w:hAnsi="Calibri" w:cs="Calibri"/>
+          <w:sz w:val="22"/>
+          <w:szCs w:val="22"/>
+        </w:rPr>
+        <w:t>Ziel der Kamerakalibrierung ist es intrinsische und extrinsische Kameraparameter zu bestimmen</w:t>
+      </w:r>
+    </w:p>
+    <w:p>
+      <w:pPr>
+        <w:rPr>
+          <w:rFonts w:ascii="Calibri" w:hAnsi="Calibri" w:cs="Calibri"/>
+          <w:sz w:val="22"/>
+          <w:szCs w:val="22"/>
+        </w:rPr>
+      </w:pPr>
+      <w:r>
+        <w:rPr>
+          <w:rFonts w:ascii="Calibri" w:hAnsi="Calibri" w:cs="Calibri"/>
+          <w:sz w:val="22"/>
+          <w:szCs w:val="22"/>
+        </w:rPr>
+        <w:t>3. Stand der Forschung</w:t>
+      </w:r>
+    </w:p>
+    <w:p>
+      <w:pPr>
+        <w:rPr>
+          <w:rFonts w:ascii="Calibri" w:hAnsi="Calibri" w:cs="Calibri"/>
+          <w:sz w:val="22"/>
+          <w:szCs w:val="22"/>
+        </w:rPr>
+      </w:pPr>
+      <w:r>
+        <w:rPr>
+          <w:rFonts w:ascii="Calibri" w:hAnsi="Calibri" w:cs="Calibri"/>
+          <w:sz w:val="22"/>
+          <w:szCs w:val="22"/>
+        </w:rPr>
+        <w:lastRenderedPageBreak/>
+        <w:t xml:space="preserve">Die Entwicklung der Blichschätzung hat sich von den klassischen modellbasierten Verfahren </w:t>
+      </w:r>
+      <w:r>
+        <w:rPr>
+          <w:rFonts w:ascii="Calibri" w:hAnsi="Calibri" w:cs="Calibri"/>
+          <w:sz w:val="22"/>
+          <w:szCs w:val="22"/>
+        </w:rPr>
+        <w:t>über</w:t>
+      </w:r>
+      <w:r>
+        <w:rPr>
+          <w:rFonts w:ascii="Calibri" w:hAnsi="Calibri" w:cs="Calibri"/>
+          <w:sz w:val="22"/>
+          <w:szCs w:val="22"/>
+        </w:rPr>
+        <w:t xml:space="preserve"> appearance-basierten Verfahren</w:t>
+      </w:r>
+      <w:r>
+        <w:rPr>
+          <w:rFonts w:ascii="Calibri" w:hAnsi="Calibri" w:cs="Calibri"/>
+          <w:sz w:val="22"/>
+          <w:szCs w:val="22"/>
+        </w:rPr>
+        <w:t xml:space="preserve"> hin zu</w:t>
+      </w:r>
+      <w:r>
+        <w:rPr>
+          <w:rFonts w:ascii="Calibri" w:hAnsi="Calibri" w:cs="Calibri"/>
+          <w:sz w:val="22"/>
+          <w:szCs w:val="22"/>
+        </w:rPr>
+        <w:t xml:space="preserve"> Deep Learning</w:t>
+      </w:r>
+      <w:r>
+        <w:rPr>
+          <w:rFonts w:ascii="Calibri" w:hAnsi="Calibri" w:cs="Calibri"/>
+          <w:sz w:val="22"/>
+          <w:szCs w:val="22"/>
+        </w:rPr>
+        <w:t xml:space="preserve"> Verfahren</w:t>
+      </w:r>
+      <w:r>
+        <w:rPr>
+          <w:rFonts w:ascii="Calibri" w:hAnsi="Calibri" w:cs="Calibri"/>
+          <w:sz w:val="22"/>
+          <w:szCs w:val="22"/>
+        </w:rPr>
+        <w:t xml:space="preserve"> entwickelt. </w:t>
+      </w:r>
+      <w:r>
+        <w:rPr>
+          <w:rFonts w:ascii="Calibri" w:hAnsi="Calibri" w:cs="Calibri"/>
+          <w:sz w:val="22"/>
+          <w:szCs w:val="22"/>
+        </w:rPr>
+        <w:t>Die Leistung dieser Ansätze hängt neben des neuronalen Netzes auch von der Qualität und Quantität der verfügbaren Datensätzen ab. Im nächsten Schritt werden die wichtigsten Datensätze des letzten Jahrzehnts beschrieben, verglichen und ihre Limitierungen hervorgehoben.</w:t>
+      </w:r>
+    </w:p>
+    <w:p>
+      <w:pPr>
+        <w:rPr>
+          <w:rFonts w:ascii="Calibri" w:hAnsi="Calibri" w:cs="Calibri"/>
+          <w:sz w:val="22"/>
+          <w:szCs w:val="22"/>
+        </w:rPr>
+      </w:pPr>
+      <w:r>
+        <w:rPr>
+          <w:rFonts w:ascii="Calibri" w:hAnsi="Calibri" w:cs="Calibri"/>
+          <w:sz w:val="22"/>
+          <w:szCs w:val="22"/>
+        </w:rPr>
+        <w:t>3.1 Moderne Datensätze</w:t>
+      </w:r>
+    </w:p>
+    <w:p>
+      <w:pPr>
+        <w:rPr>
+          <w:rFonts w:ascii="Calibri" w:hAnsi="Calibri" w:cs="Calibri"/>
+          <w:sz w:val="22"/>
+          <w:szCs w:val="22"/>
+          <w:lang w:val="en-US"/>
+        </w:rPr>
+      </w:pPr>
+      <w:r>
+        <w:rPr>
+          <w:rFonts w:ascii="Calibri" w:hAnsi="Calibri" w:cs="Calibri"/>
+          <w:sz w:val="22"/>
+          <w:szCs w:val="22"/>
+          <w:lang w:val="en-US"/>
+        </w:rPr>
+        <w:t xml:space="preserve">EYEDIAP, GazeCapture, MPIIGAZE, </w:t>
+      </w:r>
+      <w:r>
+        <w:rPr>
+          <w:rFonts w:ascii="Calibri" w:hAnsi="Calibri" w:cs="Calibri"/>
+          <w:sz w:val="22"/>
+          <w:szCs w:val="22"/>
+          <w:lang w:val="en-US"/>
+        </w:rPr>
+        <w:t>Gaze360,</w:t>
+      </w:r>
+      <w:r>
+        <w:rPr>
+          <w:rFonts w:ascii="Calibri" w:hAnsi="Calibri" w:cs="Calibri"/>
+          <w:sz w:val="22"/>
+          <w:szCs w:val="22"/>
+          <w:lang w:val="en-US"/>
+        </w:rPr>
+        <w:t xml:space="preserve"> </w:t>
+      </w:r>
+      <w:r>
+        <w:rPr>
+          <w:rFonts w:ascii="Calibri" w:hAnsi="Calibri" w:cs="Calibri"/>
+          <w:sz w:val="22"/>
+          <w:szCs w:val="22"/>
+          <w:lang w:val="en-US"/>
+        </w:rPr>
+        <w:t>EVE,</w:t>
+      </w:r>
+      <w:r>
+        <w:rPr>
+          <w:rFonts w:ascii="Calibri" w:hAnsi="Calibri" w:cs="Calibri"/>
+          <w:sz w:val="22"/>
+          <w:szCs w:val="22"/>
+          <w:lang w:val="en-US"/>
+        </w:rPr>
+        <w:t xml:space="preserve"> </w:t>
+      </w:r>
+      <w:r>
+        <w:rPr>
+          <w:rFonts w:ascii="Calibri" w:hAnsi="Calibri" w:cs="Calibri"/>
+          <w:sz w:val="22"/>
+          <w:szCs w:val="22"/>
+          <w:lang w:val="en-US"/>
+        </w:rPr>
+        <w:t>ETH-XGaze,</w:t>
+      </w:r>
+    </w:p>
+    <w:p>
+      <w:pPr>
+        <w:rPr>
+          <w:rFonts w:ascii="Calibri" w:hAnsi="Calibri" w:cs="Calibri"/>
+          <w:sz w:val="22"/>
+          <w:szCs w:val="22"/>
+        </w:rPr>
+      </w:pPr>
+      <w:r>
+        <w:rPr>
+          <w:rFonts w:ascii="Calibri" w:hAnsi="Calibri" w:cs="Calibri"/>
+          <w:sz w:val="22"/>
+          <w:szCs w:val="22"/>
+        </w:rPr>
+        <w:t>3.2 Vergleich der Datensätze</w:t>
+      </w:r>
+    </w:p>
+    <w:p>
+      <w:pPr>
+        <w:rPr>
+          <w:rFonts w:ascii="Calibri" w:hAnsi="Calibri" w:cs="Calibri"/>
+          <w:sz w:val="22"/>
+          <w:szCs w:val="22"/>
+        </w:rPr>
+      </w:pPr>
+      <w:r>
+        <w:rPr>
+          <w:rFonts w:ascii="Calibri" w:hAnsi="Calibri" w:cs="Calibri"/>
+          <w:sz w:val="22"/>
+          <w:szCs w:val="22"/>
+        </w:rPr>
+        <w:t xml:space="preserve">Quellen: </w:t>
+      </w:r>
       <w:r>
         <w:rPr>
           <w:rFonts w:ascii="Calibri" w:hAnsi="Calibri" w:cs="Calibri"/>
@@ -2728,6 +2868,115 @@
           <w:szCs w:val="22"/>
         </w:rPr>
       </w:pPr>
+      <w:r>
+        <w:rPr>
+          <w:rFonts w:ascii="Calibri" w:hAnsi="Calibri" w:cs="Calibri"/>
+          <w:sz w:val="22"/>
+          <w:szCs w:val="22"/>
+        </w:rPr>
+        <w:t>Anzahl der Probanden, Head-Pose Bereich, Blickwinkelbereich, Beleuchtungsvariation, Auflösung, Indoor/Outdoor, Person Unabhängigkeit, Verfügbarkeit, Besonderheiten</w:t>
+      </w:r>
+    </w:p>
+    <w:p>
+      <w:pPr>
+        <w:rPr>
+          <w:rFonts w:ascii="Calibri" w:hAnsi="Calibri" w:cs="Calibri"/>
+          <w:sz w:val="22"/>
+          <w:szCs w:val="22"/>
+        </w:rPr>
+      </w:pPr>
+      <w:r>
+        <w:rPr>
+          <w:rFonts w:ascii="Calibri" w:hAnsi="Calibri" w:cs="Calibri"/>
+          <w:sz w:val="22"/>
+          <w:szCs w:val="22"/>
+        </w:rPr>
+        <w:t>3.3 Limitierungen</w:t>
+      </w:r>
+    </w:p>
+    <w:p>
+      <w:pPr>
+        <w:rPr>
+          <w:rFonts w:ascii="Calibri" w:hAnsi="Calibri" w:cs="Calibri"/>
+          <w:sz w:val="22"/>
+          <w:szCs w:val="22"/>
+        </w:rPr>
+      </w:pPr>
+      <w:r>
+        <w:rPr>
+          <w:rFonts w:ascii="Calibri" w:hAnsi="Calibri" w:cs="Calibri"/>
+          <w:sz w:val="22"/>
+          <w:szCs w:val="22"/>
+        </w:rPr>
+        <w:t xml:space="preserve">Quellen: </w:t>
+      </w:r>
+      <w:r>
+        <w:rPr>
+          <w:rFonts w:ascii="Calibri" w:hAnsi="Calibri" w:cs="Calibri"/>
+          <w:sz w:val="22"/>
+          <w:szCs w:val="22"/>
+        </w:rPr>
+        <w:t>Cheng et al. (2024)</w:t>
+      </w:r>
+    </w:p>
+    <w:p>
+      <w:pPr>
+        <w:rPr>
+          <w:rFonts w:ascii="Calibri" w:hAnsi="Calibri" w:cs="Calibri"/>
+          <w:sz w:val="22"/>
+          <w:szCs w:val="22"/>
+        </w:rPr>
+      </w:pPr>
+      <w:r>
+        <w:rPr>
+          <w:rFonts w:ascii="Calibri" w:hAnsi="Calibri" w:cs="Calibri"/>
+          <w:sz w:val="22"/>
+          <w:szCs w:val="22"/>
+        </w:rPr>
+        <w:t>Datensatzbezogene Limitierungen: zu wenige Probanden, Begrenzte Diversität, wenig Brille, wenig Outdoor, fehlende Extrembedingungen</w:t>
+      </w:r>
+    </w:p>
+    <w:p>
+      <w:pPr>
+        <w:rPr>
+          <w:rFonts w:ascii="Calibri" w:hAnsi="Calibri" w:cs="Calibri"/>
+          <w:sz w:val="22"/>
+          <w:szCs w:val="22"/>
+        </w:rPr>
+      </w:pPr>
+      <w:r>
+        <w:rPr>
+          <w:rFonts w:ascii="Calibri" w:hAnsi="Calibri" w:cs="Calibri"/>
+          <w:sz w:val="22"/>
+          <w:szCs w:val="22"/>
+        </w:rPr>
+        <w:t>Methodische Limitierungen: Schlechte Generalisierung auf neue Datensätze, Kopfrotationprobleme, Schwierigkeiten bei Verdeckungen, Probleme bei schlechtem Licht</w:t>
+      </w:r>
+    </w:p>
+    <w:p>
+      <w:pPr>
+        <w:rPr>
+          <w:rFonts w:ascii="Calibri" w:hAnsi="Calibri" w:cs="Calibri"/>
+          <w:sz w:val="22"/>
+          <w:szCs w:val="22"/>
+        </w:rPr>
+      </w:pPr>
+      <w:r>
+        <w:rPr>
+          <w:rFonts w:ascii="Calibri" w:hAnsi="Calibri" w:cs="Calibri"/>
+          <w:sz w:val="22"/>
+          <w:szCs w:val="22"/>
+        </w:rPr>
+        <w:t>Praktische Limitierungen:</w:t>
+      </w:r>
+      <w:r>
+        <w:rPr>
+          <w:rFonts w:ascii="Calibri" w:hAnsi="Calibri" w:cs="Calibri"/>
+          <w:sz w:val="22"/>
+          <w:szCs w:val="22"/>
+        </w:rPr>
+        <w:t xml:space="preserve"> Kalibrierungsaufwand, Echtzeitfähigkeit, Hardwareabhängigkeit, Datenschutz</w:t>
+      </w:r>
     </w:p>
     <w:sectPr>
       <w:footerReference w:type="even" r:id="rId7"/>
@@ -5310,7 +5559,6 @@
   <w:style w:type="character" w:default="1" w:styleId="Absatz-Standardschriftart">
     <w:name w:val="Default Paragraph Font"/>
     <w:uiPriority w:val="1"/>
-    <w:semiHidden/>
     <w:unhideWhenUsed/>
   </w:style>
   <w:style w:type="table" w:default="1" w:styleId="NormaleTabelle">

</xml_diff>